<commit_message>
add SAM not finished
</commit_message>
<xml_diff>
--- a/Linux/Notes.docx
+++ b/Linux/Notes.docx
@@ -42,19 +42,8 @@
           <w:color w:val="000000" w:themeColor="text1"/>
           <w:u w:val="single"/>
         </w:rPr>
-        <w:t xml:space="preserve">Commands and what do they </w:t>
-      </w:r>
-      <w:proofErr w:type="gramStart"/>
-      <w:r>
-        <w:rPr>
-          <w:b/>
-          <w:bCs/>
-          <w:color w:val="000000" w:themeColor="text1"/>
-          <w:u w:val="single"/>
-        </w:rPr>
-        <w:t>mean?:</w:t>
-      </w:r>
-      <w:proofErr w:type="gramEnd"/>
+        <w:t>Commands and what do they mean?:</w:t>
+      </w:r>
     </w:p>
     <w:p>
       <w:pPr>
@@ -97,19 +86,11 @@
           <w:color w:val="000000" w:themeColor="text1"/>
         </w:rPr>
       </w:pPr>
-      <w:proofErr w:type="spellStart"/>
-      <w:r>
-        <w:rPr>
-          <w:color w:val="000000" w:themeColor="text1"/>
-        </w:rPr>
-        <w:t>whoami</w:t>
-      </w:r>
-      <w:proofErr w:type="spellEnd"/>
-      <w:r>
-        <w:rPr>
-          <w:color w:val="000000" w:themeColor="text1"/>
-        </w:rPr>
-        <w:t xml:space="preserve"> </w:t>
+      <w:r>
+        <w:rPr>
+          <w:color w:val="000000" w:themeColor="text1"/>
+        </w:rPr>
+        <w:t xml:space="preserve">whoami </w:t>
       </w:r>
       <w:r>
         <w:rPr>
@@ -165,47 +146,11 @@
           <w:color w:val="000000" w:themeColor="text1"/>
         </w:rPr>
       </w:pPr>
-      <w:proofErr w:type="gramStart"/>
-      <w:r>
-        <w:rPr>
-          <w:color w:val="000000" w:themeColor="text1"/>
-        </w:rPr>
-        <w:t>we</w:t>
-      </w:r>
-      <w:proofErr w:type="gramEnd"/>
-      <w:r>
-        <w:rPr>
-          <w:color w:val="000000" w:themeColor="text1"/>
-        </w:rPr>
-        <w:t xml:space="preserve"> can set a variable </w:t>
-      </w:r>
-      <w:proofErr w:type="gramStart"/>
-      <w:r>
-        <w:rPr>
-          <w:color w:val="000000" w:themeColor="text1"/>
-        </w:rPr>
-        <w:t>normally</w:t>
-      </w:r>
-      <w:proofErr w:type="gramEnd"/>
-      <w:r>
-        <w:rPr>
-          <w:color w:val="000000" w:themeColor="text1"/>
-        </w:rPr>
-        <w:t xml:space="preserve"> for </w:t>
-      </w:r>
-      <w:proofErr w:type="gramStart"/>
-      <w:r>
-        <w:rPr>
-          <w:color w:val="000000" w:themeColor="text1"/>
-        </w:rPr>
-        <w:t>example</w:t>
-      </w:r>
-      <w:proofErr w:type="gramEnd"/>
-      <w:r>
-        <w:rPr>
-          <w:color w:val="000000" w:themeColor="text1"/>
-        </w:rPr>
-        <w:t xml:space="preserve"> name= </w:t>
+      <w:r>
+        <w:rPr>
+          <w:color w:val="000000" w:themeColor="text1"/>
+        </w:rPr>
+        <w:t xml:space="preserve">we can set a variable normally for example name= </w:t>
       </w:r>
       <w:r>
         <w:rPr>
@@ -219,7 +164,6 @@
         </w:rPr>
         <w:t>john</w:t>
       </w:r>
-      <w:proofErr w:type="gramStart"/>
       <w:r>
         <w:rPr>
           <w:color w:val="000000" w:themeColor="text1"/>
@@ -230,28 +174,7 @@
         <w:rPr>
           <w:color w:val="000000" w:themeColor="text1"/>
         </w:rPr>
-        <w:t>,</w:t>
-      </w:r>
-      <w:proofErr w:type="gramEnd"/>
-      <w:r>
-        <w:rPr>
-          <w:color w:val="000000" w:themeColor="text1"/>
-        </w:rPr>
-        <w:t xml:space="preserve"> it </w:t>
-      </w:r>
-      <w:proofErr w:type="gramStart"/>
-      <w:r>
-        <w:rPr>
-          <w:color w:val="000000" w:themeColor="text1"/>
-        </w:rPr>
-        <w:t>important</w:t>
-      </w:r>
-      <w:proofErr w:type="gramEnd"/>
-      <w:r>
-        <w:rPr>
-          <w:color w:val="000000" w:themeColor="text1"/>
-        </w:rPr>
-        <w:t xml:space="preserve"> to include no spaces in between</w:t>
+        <w:t>, it important to include no spaces in between</w:t>
       </w:r>
     </w:p>
     <w:p>
@@ -287,35 +210,7 @@
         <w:rPr>
           <w:color w:val="000000" w:themeColor="text1"/>
         </w:rPr>
-        <w:t>we can echo “$</w:t>
-      </w:r>
-      <w:proofErr w:type="spellStart"/>
-      <w:r>
-        <w:rPr>
-          <w:color w:val="000000" w:themeColor="text1"/>
-        </w:rPr>
-        <w:t>variable_name</w:t>
-      </w:r>
-      <w:proofErr w:type="spellEnd"/>
-      <w:r>
-        <w:rPr>
-          <w:color w:val="000000" w:themeColor="text1"/>
-        </w:rPr>
-        <w:t xml:space="preserve"> some random text $</w:t>
-      </w:r>
-      <w:proofErr w:type="spellStart"/>
-      <w:r>
-        <w:rPr>
-          <w:color w:val="000000" w:themeColor="text1"/>
-        </w:rPr>
-        <w:t>another_variable_name</w:t>
-      </w:r>
-      <w:proofErr w:type="spellEnd"/>
-      <w:r>
-        <w:rPr>
-          <w:color w:val="000000" w:themeColor="text1"/>
-        </w:rPr>
-        <w:t>”</w:t>
+        <w:t>we can echo “$variable_name some random text $another_variable_name”</w:t>
       </w:r>
     </w:p>
     <w:p>
@@ -329,19 +224,11 @@
           <w:color w:val="000000" w:themeColor="text1"/>
         </w:rPr>
       </w:pPr>
-      <w:proofErr w:type="gramStart"/>
-      <w:r>
-        <w:rPr>
-          <w:color w:val="000000" w:themeColor="text1"/>
-        </w:rPr>
-        <w:t>writing</w:t>
-      </w:r>
-      <w:proofErr w:type="gramEnd"/>
-      <w:r>
-        <w:rPr>
-          <w:color w:val="000000" w:themeColor="text1"/>
-        </w:rPr>
-        <w:t xml:space="preserve"> history gives us the history of our commands even if we cleared the shell before</w:t>
+      <w:r>
+        <w:rPr>
+          <w:color w:val="000000" w:themeColor="text1"/>
+        </w:rPr>
+        <w:t>writing history gives us the history of our commands even if we cleared the shell before</w:t>
       </w:r>
     </w:p>
     <w:p>
@@ -355,19 +242,11 @@
           <w:color w:val="000000" w:themeColor="text1"/>
         </w:rPr>
       </w:pPr>
-      <w:proofErr w:type="spellStart"/>
-      <w:r>
-        <w:rPr>
-          <w:color w:val="000000" w:themeColor="text1"/>
-        </w:rPr>
-        <w:t>pwd</w:t>
-      </w:r>
-      <w:proofErr w:type="spellEnd"/>
-      <w:r>
-        <w:rPr>
-          <w:color w:val="000000" w:themeColor="text1"/>
-        </w:rPr>
-        <w:t xml:space="preserve"> </w:t>
+      <w:r>
+        <w:rPr>
+          <w:color w:val="000000" w:themeColor="text1"/>
+        </w:rPr>
+        <w:t xml:space="preserve">pwd </w:t>
       </w:r>
       <w:r>
         <w:rPr>
@@ -393,6 +272,36 @@
           <w:color w:val="000000" w:themeColor="text1"/>
         </w:rPr>
       </w:pPr>
+      <w:r>
+        <w:rPr>
+          <w:color w:val="000000" w:themeColor="text1"/>
+        </w:rPr>
+        <w:t xml:space="preserve">everything on linux is a file, </w:t>
+      </w:r>
+      <w:r>
+        <w:rPr>
+          <w:color w:val="000000" w:themeColor="text1"/>
+        </w:rPr>
+        <w:t>the network config, even the commands are files</w:t>
+      </w:r>
+    </w:p>
+    <w:p>
+      <w:pPr>
+        <w:pStyle w:val="ListParagraph"/>
+        <w:numPr>
+          <w:ilvl w:val="0"/>
+          <w:numId w:val="1"/>
+        </w:numPr>
+        <w:rPr>
+          <w:color w:val="000000" w:themeColor="text1"/>
+        </w:rPr>
+      </w:pPr>
+      <w:r>
+        <w:rPr>
+          <w:color w:val="000000" w:themeColor="text1"/>
+        </w:rPr>
+        <w:t>the file called bin inside our root is not standing for trash bin. It starts for binaries which all the commands are stored.</w:t>
+      </w:r>
     </w:p>
     <w:sectPr>
       <w:pgSz w:w="12240" w:h="15840"/>

</xml_diff>

<commit_message>
add linux notes day 2 finished
</commit_message>
<xml_diff>
--- a/Linux/Notes.docx
+++ b/Linux/Notes.docx
@@ -58,9 +58,17 @@
       </w:pPr>
       <w:r>
         <w:rPr>
-          <w:color w:val="000000" w:themeColor="text1"/>
-        </w:rPr>
-        <w:t xml:space="preserve">echo </w:t>
+          <w:b/>
+          <w:bCs/>
+          <w:color w:val="000000" w:themeColor="text1"/>
+        </w:rPr>
+        <w:t>echo</w:t>
+      </w:r>
+      <w:r>
+        <w:rPr>
+          <w:color w:val="000000" w:themeColor="text1"/>
+        </w:rPr>
+        <w:t xml:space="preserve"> </w:t>
       </w:r>
       <w:r>
         <w:rPr>
@@ -86,11 +94,21 @@
           <w:color w:val="000000" w:themeColor="text1"/>
         </w:rPr>
       </w:pPr>
-      <w:r>
-        <w:rPr>
-          <w:color w:val="000000" w:themeColor="text1"/>
-        </w:rPr>
-        <w:t xml:space="preserve">whoami </w:t>
+      <w:proofErr w:type="spellStart"/>
+      <w:r>
+        <w:rPr>
+          <w:b/>
+          <w:bCs/>
+          <w:color w:val="000000" w:themeColor="text1"/>
+        </w:rPr>
+        <w:t>whoami</w:t>
+      </w:r>
+      <w:proofErr w:type="spellEnd"/>
+      <w:r>
+        <w:rPr>
+          <w:color w:val="000000" w:themeColor="text1"/>
+        </w:rPr>
+        <w:t xml:space="preserve"> </w:t>
       </w:r>
       <w:r>
         <w:rPr>
@@ -118,9 +136,17 @@
       </w:pPr>
       <w:r>
         <w:rPr>
-          <w:color w:val="000000" w:themeColor="text1"/>
-        </w:rPr>
-        <w:t xml:space="preserve">expr </w:t>
+          <w:b/>
+          <w:bCs/>
+          <w:color w:val="000000" w:themeColor="text1"/>
+        </w:rPr>
+        <w:t>expr</w:t>
+      </w:r>
+      <w:r>
+        <w:rPr>
+          <w:color w:val="000000" w:themeColor="text1"/>
+        </w:rPr>
+        <w:t xml:space="preserve"> </w:t>
       </w:r>
       <w:r>
         <w:rPr>
@@ -132,7 +158,21 @@
         <w:rPr>
           <w:color w:val="000000" w:themeColor="text1"/>
         </w:rPr>
-        <w:t xml:space="preserve"> lets us do some calculations in the shell for example expr 20+2 will result in 22 but writing it without expr means It wont do anything </w:t>
+        <w:t xml:space="preserve"> lets us do some calculations in the shell for example expr 20+2 will result in 22 but writing it without expr means It </w:t>
+      </w:r>
+      <w:proofErr w:type="spellStart"/>
+      <w:r>
+        <w:rPr>
+          <w:color w:val="000000" w:themeColor="text1"/>
+        </w:rPr>
+        <w:t>wont</w:t>
+      </w:r>
+      <w:proofErr w:type="spellEnd"/>
+      <w:r>
+        <w:rPr>
+          <w:color w:val="000000" w:themeColor="text1"/>
+        </w:rPr>
+        <w:t xml:space="preserve"> do anything </w:t>
       </w:r>
     </w:p>
     <w:p>
@@ -150,7 +190,21 @@
         <w:rPr>
           <w:color w:val="000000" w:themeColor="text1"/>
         </w:rPr>
-        <w:t xml:space="preserve">we can set a variable normally for example name= </w:t>
+        <w:t xml:space="preserve">we can set a variable normally for example </w:t>
+      </w:r>
+      <w:r>
+        <w:rPr>
+          <w:b/>
+          <w:bCs/>
+          <w:color w:val="000000" w:themeColor="text1"/>
+        </w:rPr>
+        <w:t>name</w:t>
+      </w:r>
+      <w:r>
+        <w:rPr>
+          <w:color w:val="000000" w:themeColor="text1"/>
+        </w:rPr>
+        <w:t xml:space="preserve">= </w:t>
       </w:r>
       <w:r>
         <w:rPr>
@@ -160,15 +214,25 @@
       </w:r>
       <w:r>
         <w:rPr>
+          <w:b/>
+          <w:bCs/>
           <w:color w:val="000000" w:themeColor="text1"/>
         </w:rPr>
         <w:t>john</w:t>
       </w:r>
       <w:r>
         <w:rPr>
-          <w:color w:val="000000" w:themeColor="text1"/>
-        </w:rPr>
-        <w:t xml:space="preserve">’ </w:t>
+          <w:b/>
+          <w:bCs/>
+          <w:color w:val="000000" w:themeColor="text1"/>
+        </w:rPr>
+        <w:t>’</w:t>
+      </w:r>
+      <w:r>
+        <w:rPr>
+          <w:color w:val="000000" w:themeColor="text1"/>
+        </w:rPr>
+        <w:t xml:space="preserve"> </w:t>
       </w:r>
       <w:r>
         <w:rPr>
@@ -203,14 +267,60 @@
           <w:numId w:val="1"/>
         </w:numPr>
         <w:rPr>
-          <w:color w:val="000000" w:themeColor="text1"/>
-        </w:rPr>
-      </w:pPr>
-      <w:r>
-        <w:rPr>
-          <w:color w:val="000000" w:themeColor="text1"/>
-        </w:rPr>
-        <w:t>we can echo “$variable_name some random text $another_variable_name”</w:t>
+          <w:b/>
+          <w:bCs/>
+          <w:color w:val="000000" w:themeColor="text1"/>
+        </w:rPr>
+      </w:pPr>
+      <w:r>
+        <w:rPr>
+          <w:color w:val="000000" w:themeColor="text1"/>
+        </w:rPr>
+        <w:t xml:space="preserve">we can </w:t>
+      </w:r>
+      <w:r>
+        <w:rPr>
+          <w:b/>
+          <w:bCs/>
+          <w:color w:val="000000" w:themeColor="text1"/>
+        </w:rPr>
+        <w:t>echo “$</w:t>
+      </w:r>
+      <w:proofErr w:type="spellStart"/>
+      <w:r>
+        <w:rPr>
+          <w:b/>
+          <w:bCs/>
+          <w:color w:val="000000" w:themeColor="text1"/>
+        </w:rPr>
+        <w:t>variable_name</w:t>
+      </w:r>
+      <w:proofErr w:type="spellEnd"/>
+      <w:r>
+        <w:rPr>
+          <w:b/>
+          <w:bCs/>
+          <w:color w:val="000000" w:themeColor="text1"/>
+        </w:rPr>
+        <w:t xml:space="preserve"> some random text $</w:t>
+      </w:r>
+      <w:proofErr w:type="spellStart"/>
+      <w:r>
+        <w:rPr>
+          <w:b/>
+          <w:bCs/>
+          <w:color w:val="000000" w:themeColor="text1"/>
+        </w:rPr>
+        <w:t>another_variable_name</w:t>
+      </w:r>
+      <w:proofErr w:type="spellEnd"/>
+      <w:r>
+        <w:rPr>
+          <w:b/>
+          <w:bCs/>
+          <w:color w:val="000000" w:themeColor="text1"/>
+        </w:rPr>
+        <w:t>”</w:t>
       </w:r>
     </w:p>
     <w:p>
@@ -228,7 +338,21 @@
         <w:rPr>
           <w:color w:val="000000" w:themeColor="text1"/>
         </w:rPr>
-        <w:t>writing history gives us the history of our commands even if we cleared the shell before</w:t>
+        <w:t xml:space="preserve">writing </w:t>
+      </w:r>
+      <w:r>
+        <w:rPr>
+          <w:b/>
+          <w:bCs/>
+          <w:color w:val="000000" w:themeColor="text1"/>
+        </w:rPr>
+        <w:t>history</w:t>
+      </w:r>
+      <w:r>
+        <w:rPr>
+          <w:color w:val="000000" w:themeColor="text1"/>
+        </w:rPr>
+        <w:t xml:space="preserve"> gives us the history of our commands even if we cleared the shell before</w:t>
       </w:r>
     </w:p>
     <w:p>
@@ -242,14 +366,28 @@
           <w:color w:val="000000" w:themeColor="text1"/>
         </w:rPr>
       </w:pPr>
-      <w:r>
-        <w:rPr>
-          <w:color w:val="000000" w:themeColor="text1"/>
-        </w:rPr>
-        <w:t xml:space="preserve">pwd </w:t>
-      </w:r>
-      <w:r>
-        <w:rPr>
+      <w:proofErr w:type="spellStart"/>
+      <w:r>
+        <w:rPr>
+          <w:b/>
+          <w:bCs/>
+          <w:color w:val="000000" w:themeColor="text1"/>
+        </w:rPr>
+        <w:t>pwd</w:t>
+      </w:r>
+      <w:proofErr w:type="spellEnd"/>
+      <w:r>
+        <w:rPr>
+          <w:b/>
+          <w:bCs/>
+          <w:color w:val="000000" w:themeColor="text1"/>
+        </w:rPr>
+        <w:t xml:space="preserve"> </w:t>
+      </w:r>
+      <w:r>
+        <w:rPr>
+          <w:b/>
+          <w:bCs/>
           <w:color w:val="000000" w:themeColor="text1"/>
         </w:rPr>
         <w:sym w:font="Wingdings" w:char="F0E0"/>
@@ -276,7 +414,21 @@
         <w:rPr>
           <w:color w:val="000000" w:themeColor="text1"/>
         </w:rPr>
-        <w:t xml:space="preserve">everything on linux is a file, </w:t>
+        <w:t xml:space="preserve">everything on </w:t>
+      </w:r>
+      <w:proofErr w:type="spellStart"/>
+      <w:r>
+        <w:rPr>
+          <w:color w:val="000000" w:themeColor="text1"/>
+        </w:rPr>
+        <w:t>linux</w:t>
+      </w:r>
+      <w:proofErr w:type="spellEnd"/>
+      <w:r>
+        <w:rPr>
+          <w:color w:val="000000" w:themeColor="text1"/>
+        </w:rPr>
+        <w:t xml:space="preserve"> is a file, </w:t>
       </w:r>
       <w:r>
         <w:rPr>
@@ -302,6 +454,935 @@
         </w:rPr>
         <w:t>the file called bin inside our root is not standing for trash bin. It starts for binaries which all the commands are stored.</w:t>
       </w:r>
+    </w:p>
+    <w:p>
+      <w:pPr>
+        <w:pStyle w:val="ListParagraph"/>
+        <w:numPr>
+          <w:ilvl w:val="0"/>
+          <w:numId w:val="1"/>
+        </w:numPr>
+        <w:rPr>
+          <w:color w:val="000000" w:themeColor="text1"/>
+        </w:rPr>
+      </w:pPr>
+      <w:r>
+        <w:rPr>
+          <w:color w:val="000000" w:themeColor="text1"/>
+        </w:rPr>
+        <w:t>Absolute path which start with / tells the system where a file or a directory are located from the root while a relative path which does not start with / tells the system where the file is from where we are at that exact moment</w:t>
+      </w:r>
+    </w:p>
+    <w:p>
+      <w:pPr>
+        <w:pStyle w:val="ListParagraph"/>
+        <w:numPr>
+          <w:ilvl w:val="0"/>
+          <w:numId w:val="1"/>
+        </w:numPr>
+        <w:rPr>
+          <w:color w:val="000000" w:themeColor="text1"/>
+        </w:rPr>
+      </w:pPr>
+      <w:r>
+        <w:rPr>
+          <w:b/>
+          <w:bCs/>
+          <w:color w:val="000000" w:themeColor="text1"/>
+        </w:rPr>
+        <w:t xml:space="preserve">cat file.txt </w:t>
+      </w:r>
+      <w:r>
+        <w:rPr>
+          <w:b/>
+          <w:bCs/>
+          <w:color w:val="000000" w:themeColor="text1"/>
+        </w:rPr>
+        <w:sym w:font="Wingdings" w:char="F0E0"/>
+      </w:r>
+      <w:r>
+        <w:rPr>
+          <w:color w:val="000000" w:themeColor="text1"/>
+        </w:rPr>
+        <w:t xml:space="preserve"> this command print a file to the terminal, and it stands for concatenate where we can write cat file.txt file2.txt and it will print them concatenated.</w:t>
+      </w:r>
+    </w:p>
+    <w:p>
+      <w:pPr>
+        <w:pStyle w:val="ListParagraph"/>
+        <w:numPr>
+          <w:ilvl w:val="0"/>
+          <w:numId w:val="1"/>
+        </w:numPr>
+        <w:rPr>
+          <w:color w:val="000000" w:themeColor="text1"/>
+        </w:rPr>
+      </w:pPr>
+      <w:r>
+        <w:rPr>
+          <w:b/>
+          <w:bCs/>
+          <w:color w:val="000000" w:themeColor="text1"/>
+        </w:rPr>
+        <w:t xml:space="preserve">head -n </w:t>
+      </w:r>
+      <w:proofErr w:type="spellStart"/>
+      <w:r>
+        <w:rPr>
+          <w:b/>
+          <w:bCs/>
+          <w:color w:val="000000" w:themeColor="text1"/>
+        </w:rPr>
+        <w:t>numberoflines</w:t>
+      </w:r>
+      <w:proofErr w:type="spellEnd"/>
+      <w:r>
+        <w:rPr>
+          <w:b/>
+          <w:bCs/>
+          <w:color w:val="000000" w:themeColor="text1"/>
+        </w:rPr>
+        <w:t xml:space="preserve"> file.csv </w:t>
+      </w:r>
+      <w:r>
+        <w:rPr>
+          <w:b/>
+          <w:bCs/>
+          <w:color w:val="000000" w:themeColor="text1"/>
+        </w:rPr>
+        <w:sym w:font="Wingdings" w:char="F0E0"/>
+      </w:r>
+      <w:r>
+        <w:rPr>
+          <w:color w:val="000000" w:themeColor="text1"/>
+        </w:rPr>
+        <w:t xml:space="preserve"> </w:t>
+      </w:r>
+      <w:r>
+        <w:rPr>
+          <w:color w:val="000000" w:themeColor="text1"/>
+        </w:rPr>
+        <w:t>gives us the first few lines of the file</w:t>
+      </w:r>
+    </w:p>
+    <w:p>
+      <w:pPr>
+        <w:pStyle w:val="ListParagraph"/>
+        <w:numPr>
+          <w:ilvl w:val="0"/>
+          <w:numId w:val="1"/>
+        </w:numPr>
+        <w:rPr>
+          <w:color w:val="000000" w:themeColor="text1"/>
+        </w:rPr>
+      </w:pPr>
+      <w:r>
+        <w:rPr>
+          <w:b/>
+          <w:bCs/>
+          <w:color w:val="000000" w:themeColor="text1"/>
+        </w:rPr>
+        <w:t>tail</w:t>
+      </w:r>
+      <w:r>
+        <w:rPr>
+          <w:b/>
+          <w:bCs/>
+          <w:color w:val="000000" w:themeColor="text1"/>
+        </w:rPr>
+        <w:t xml:space="preserve"> -n </w:t>
+      </w:r>
+      <w:proofErr w:type="spellStart"/>
+      <w:r>
+        <w:rPr>
+          <w:b/>
+          <w:bCs/>
+          <w:color w:val="000000" w:themeColor="text1"/>
+        </w:rPr>
+        <w:t>numberoflines</w:t>
+      </w:r>
+      <w:proofErr w:type="spellEnd"/>
+      <w:r>
+        <w:rPr>
+          <w:b/>
+          <w:bCs/>
+          <w:color w:val="000000" w:themeColor="text1"/>
+        </w:rPr>
+        <w:t xml:space="preserve"> file.csv </w:t>
+      </w:r>
+      <w:r>
+        <w:rPr>
+          <w:b/>
+          <w:bCs/>
+          <w:color w:val="000000" w:themeColor="text1"/>
+        </w:rPr>
+        <w:sym w:font="Wingdings" w:char="F0E0"/>
+      </w:r>
+      <w:r>
+        <w:rPr>
+          <w:color w:val="000000" w:themeColor="text1"/>
+        </w:rPr>
+        <w:t xml:space="preserve"> </w:t>
+      </w:r>
+      <w:r>
+        <w:rPr>
+          <w:color w:val="000000" w:themeColor="text1"/>
+        </w:rPr>
+        <w:t xml:space="preserve">gives us the </w:t>
+      </w:r>
+      <w:r>
+        <w:rPr>
+          <w:color w:val="000000" w:themeColor="text1"/>
+        </w:rPr>
+        <w:t>last</w:t>
+      </w:r>
+      <w:r>
+        <w:rPr>
+          <w:color w:val="000000" w:themeColor="text1"/>
+        </w:rPr>
+        <w:t xml:space="preserve"> few lines of the fi</w:t>
+      </w:r>
+      <w:r>
+        <w:rPr>
+          <w:color w:val="000000" w:themeColor="text1"/>
+        </w:rPr>
+        <w:t>le</w:t>
+      </w:r>
+    </w:p>
+    <w:p>
+      <w:pPr>
+        <w:pStyle w:val="ListParagraph"/>
+        <w:numPr>
+          <w:ilvl w:val="0"/>
+          <w:numId w:val="1"/>
+        </w:numPr>
+        <w:rPr>
+          <w:color w:val="000000" w:themeColor="text1"/>
+        </w:rPr>
+      </w:pPr>
+      <w:r>
+        <w:rPr>
+          <w:b/>
+          <w:bCs/>
+          <w:color w:val="000000" w:themeColor="text1"/>
+        </w:rPr>
+        <w:t>less</w:t>
+      </w:r>
+      <w:r>
+        <w:rPr>
+          <w:b/>
+          <w:bCs/>
+          <w:color w:val="000000" w:themeColor="text1"/>
+        </w:rPr>
+        <w:t xml:space="preserve"> file.txt </w:t>
+      </w:r>
+      <w:r>
+        <w:rPr>
+          <w:b/>
+          <w:bCs/>
+          <w:color w:val="000000" w:themeColor="text1"/>
+        </w:rPr>
+        <w:sym w:font="Wingdings" w:char="F0E0"/>
+      </w:r>
+      <w:r>
+        <w:rPr>
+          <w:color w:val="000000" w:themeColor="text1"/>
+        </w:rPr>
+        <w:t xml:space="preserve"> lets you view a file one screen at a time. You can scroll up/down and search.</w:t>
+      </w:r>
+      <w:r>
+        <w:rPr>
+          <w:color w:val="000000" w:themeColor="text1"/>
+        </w:rPr>
+        <w:t xml:space="preserve"> Its more powerful and preferred </w:t>
+      </w:r>
+    </w:p>
+    <w:p>
+      <w:pPr>
+        <w:pStyle w:val="ListParagraph"/>
+        <w:numPr>
+          <w:ilvl w:val="0"/>
+          <w:numId w:val="1"/>
+        </w:numPr>
+        <w:rPr>
+          <w:color w:val="000000" w:themeColor="text1"/>
+        </w:rPr>
+      </w:pPr>
+      <w:r>
+        <w:rPr>
+          <w:b/>
+          <w:bCs/>
+          <w:color w:val="000000" w:themeColor="text1"/>
+        </w:rPr>
+        <w:t>more</w:t>
+      </w:r>
+      <w:r>
+        <w:rPr>
+          <w:b/>
+          <w:bCs/>
+          <w:color w:val="000000" w:themeColor="text1"/>
+        </w:rPr>
+        <w:t xml:space="preserve"> file.txt </w:t>
+      </w:r>
+      <w:r>
+        <w:rPr>
+          <w:b/>
+          <w:bCs/>
+          <w:color w:val="000000" w:themeColor="text1"/>
+        </w:rPr>
+        <w:sym w:font="Wingdings" w:char="F0E0"/>
+      </w:r>
+      <w:r>
+        <w:rPr>
+          <w:color w:val="000000" w:themeColor="text1"/>
+        </w:rPr>
+        <w:t xml:space="preserve"> also displays a file one screen at a time, but it is simpler and traditionally mainly moves forward through the file.</w:t>
+      </w:r>
+    </w:p>
+    <w:p>
+      <w:pPr>
+        <w:pStyle w:val="ListParagraph"/>
+        <w:numPr>
+          <w:ilvl w:val="0"/>
+          <w:numId w:val="1"/>
+        </w:numPr>
+        <w:rPr>
+          <w:color w:val="000000" w:themeColor="text1"/>
+        </w:rPr>
+      </w:pPr>
+      <w:r>
+        <w:rPr>
+          <w:b/>
+          <w:bCs/>
+          <w:color w:val="000000" w:themeColor="text1"/>
+        </w:rPr>
+        <w:t>less -N name.txt</w:t>
+      </w:r>
+      <w:r>
+        <w:rPr>
+          <w:color w:val="000000" w:themeColor="text1"/>
+        </w:rPr>
+        <w:t xml:space="preserve"> </w:t>
+      </w:r>
+      <w:r>
+        <w:rPr>
+          <w:color w:val="000000" w:themeColor="text1"/>
+        </w:rPr>
+        <w:sym w:font="Wingdings" w:char="F0E0"/>
+      </w:r>
+      <w:r>
+        <w:rPr>
+          <w:color w:val="000000" w:themeColor="text1"/>
+        </w:rPr>
+        <w:t xml:space="preserve"> </w:t>
+      </w:r>
+      <w:r>
+        <w:rPr>
+          <w:color w:val="000000" w:themeColor="text1"/>
+        </w:rPr>
+        <w:t xml:space="preserve"> </w:t>
+      </w:r>
+      <w:r>
+        <w:rPr>
+          <w:b/>
+          <w:bCs/>
+          <w:color w:val="000000" w:themeColor="text1"/>
+        </w:rPr>
+        <w:t>less</w:t>
+      </w:r>
+      <w:r>
+        <w:rPr>
+          <w:color w:val="000000" w:themeColor="text1"/>
+        </w:rPr>
+        <w:t xml:space="preserve"> → view the file</w:t>
+      </w:r>
+      <w:r>
+        <w:rPr>
+          <w:color w:val="000000" w:themeColor="text1"/>
+        </w:rPr>
+        <w:t>.</w:t>
+      </w:r>
+      <w:r>
+        <w:rPr>
+          <w:color w:val="000000" w:themeColor="text1"/>
+        </w:rPr>
+        <w:t xml:space="preserve">  -</w:t>
+      </w:r>
+      <w:r>
+        <w:rPr>
+          <w:b/>
+          <w:bCs/>
+          <w:color w:val="000000" w:themeColor="text1"/>
+        </w:rPr>
+        <w:t>N</w:t>
+      </w:r>
+      <w:r>
+        <w:rPr>
+          <w:color w:val="000000" w:themeColor="text1"/>
+        </w:rPr>
+        <w:t xml:space="preserve"> → show line numbers</w:t>
+      </w:r>
+      <w:r>
+        <w:rPr>
+          <w:color w:val="000000" w:themeColor="text1"/>
+        </w:rPr>
+        <w:t xml:space="preserve">. </w:t>
+      </w:r>
+      <w:r>
+        <w:rPr>
+          <w:color w:val="000000" w:themeColor="text1"/>
+        </w:rPr>
+        <w:t xml:space="preserve"> </w:t>
+      </w:r>
+      <w:r>
+        <w:rPr>
+          <w:b/>
+          <w:bCs/>
+          <w:color w:val="000000" w:themeColor="text1"/>
+        </w:rPr>
+        <w:t>q</w:t>
+      </w:r>
+      <w:r>
+        <w:rPr>
+          <w:color w:val="000000" w:themeColor="text1"/>
+        </w:rPr>
+        <w:t xml:space="preserve"> → exit less</w:t>
+      </w:r>
+    </w:p>
+    <w:p>
+      <w:pPr>
+        <w:pStyle w:val="ListParagraph"/>
+        <w:numPr>
+          <w:ilvl w:val="0"/>
+          <w:numId w:val="1"/>
+        </w:numPr>
+        <w:rPr>
+          <w:color w:val="000000" w:themeColor="text1"/>
+        </w:rPr>
+      </w:pPr>
+      <w:r>
+        <w:rPr>
+          <w:b/>
+          <w:bCs/>
+          <w:color w:val="000000" w:themeColor="text1"/>
+        </w:rPr>
+        <w:t>touch file.txt</w:t>
+      </w:r>
+      <w:r>
+        <w:rPr>
+          <w:color w:val="000000" w:themeColor="text1"/>
+        </w:rPr>
+        <w:t xml:space="preserve"> </w:t>
+      </w:r>
+      <w:r>
+        <w:rPr>
+          <w:color w:val="000000" w:themeColor="text1"/>
+        </w:rPr>
+        <w:sym w:font="Wingdings" w:char="F0E0"/>
+      </w:r>
+      <w:r>
+        <w:rPr>
+          <w:color w:val="000000" w:themeColor="text1"/>
+        </w:rPr>
+        <w:t xml:space="preserve"> </w:t>
+      </w:r>
+      <w:r>
+        <w:rPr>
+          <w:color w:val="000000" w:themeColor="text1"/>
+        </w:rPr>
+        <w:t>If it already exists keeps the contents unchanged and updates its timestamp.</w:t>
+      </w:r>
+      <w:r>
+        <w:rPr>
+          <w:color w:val="000000" w:themeColor="text1"/>
+        </w:rPr>
+        <w:t xml:space="preserve"> If it does not exist then create the file</w:t>
+      </w:r>
+      <w:r>
+        <w:rPr>
+          <w:color w:val="000000" w:themeColor="text1"/>
+        </w:rPr>
+        <w:t>.</w:t>
+      </w:r>
+    </w:p>
+    <w:p>
+      <w:pPr>
+        <w:pStyle w:val="ListParagraph"/>
+        <w:numPr>
+          <w:ilvl w:val="0"/>
+          <w:numId w:val="1"/>
+        </w:numPr>
+        <w:rPr>
+          <w:color w:val="000000" w:themeColor="text1"/>
+        </w:rPr>
+      </w:pPr>
+      <w:r>
+        <w:rPr>
+          <w:color w:val="000000" w:themeColor="text1"/>
+        </w:rPr>
+        <w:t xml:space="preserve">Every file on </w:t>
+      </w:r>
+      <w:proofErr w:type="spellStart"/>
+      <w:r>
+        <w:rPr>
+          <w:color w:val="000000" w:themeColor="text1"/>
+        </w:rPr>
+        <w:t>linux</w:t>
+      </w:r>
+      <w:proofErr w:type="spellEnd"/>
+      <w:r>
+        <w:rPr>
+          <w:color w:val="000000" w:themeColor="text1"/>
+        </w:rPr>
+        <w:t xml:space="preserve"> has a timestamp of when it was created and when it was updated</w:t>
+      </w:r>
+    </w:p>
+    <w:p>
+      <w:pPr>
+        <w:pStyle w:val="ListParagraph"/>
+        <w:numPr>
+          <w:ilvl w:val="0"/>
+          <w:numId w:val="1"/>
+        </w:numPr>
+        <w:rPr>
+          <w:color w:val="000000" w:themeColor="text1"/>
+        </w:rPr>
+      </w:pPr>
+      <w:proofErr w:type="spellStart"/>
+      <w:r>
+        <w:rPr>
+          <w:b/>
+          <w:bCs/>
+          <w:color w:val="000000" w:themeColor="text1"/>
+        </w:rPr>
+        <w:t>mkdir</w:t>
+      </w:r>
+      <w:proofErr w:type="spellEnd"/>
+      <w:r>
+        <w:rPr>
+          <w:b/>
+          <w:bCs/>
+          <w:color w:val="000000" w:themeColor="text1"/>
+        </w:rPr>
+        <w:t xml:space="preserve"> </w:t>
+      </w:r>
+      <w:r>
+        <w:rPr>
+          <w:color w:val="000000" w:themeColor="text1"/>
+        </w:rPr>
+        <w:sym w:font="Wingdings" w:char="F0E0"/>
+      </w:r>
+      <w:r>
+        <w:rPr>
+          <w:color w:val="000000" w:themeColor="text1"/>
+        </w:rPr>
+        <w:t xml:space="preserve"> is used to create a new </w:t>
+      </w:r>
+      <w:proofErr w:type="spellStart"/>
+      <w:r>
+        <w:rPr>
+          <w:color w:val="000000" w:themeColor="text1"/>
+        </w:rPr>
+        <w:t>dir</w:t>
+      </w:r>
+      <w:proofErr w:type="spellEnd"/>
+      <w:r>
+        <w:rPr>
+          <w:color w:val="000000" w:themeColor="text1"/>
+        </w:rPr>
+        <w:t xml:space="preserve"> inside our current directory</w:t>
+      </w:r>
+    </w:p>
+    <w:p>
+      <w:pPr>
+        <w:pStyle w:val="ListParagraph"/>
+        <w:numPr>
+          <w:ilvl w:val="0"/>
+          <w:numId w:val="1"/>
+        </w:numPr>
+        <w:rPr>
+          <w:color w:val="000000" w:themeColor="text1"/>
+        </w:rPr>
+      </w:pPr>
+      <w:r>
+        <w:rPr>
+          <w:b/>
+          <w:bCs/>
+          <w:color w:val="000000" w:themeColor="text1"/>
+        </w:rPr>
+        <w:t>mv</w:t>
+      </w:r>
+      <w:r>
+        <w:rPr>
+          <w:color w:val="000000" w:themeColor="text1"/>
+        </w:rPr>
+        <w:t xml:space="preserve"> </w:t>
+      </w:r>
+      <w:r>
+        <w:rPr>
+          <w:color w:val="000000" w:themeColor="text1"/>
+        </w:rPr>
+        <w:sym w:font="Wingdings" w:char="F0E0"/>
+      </w:r>
+      <w:r>
+        <w:rPr>
+          <w:color w:val="000000" w:themeColor="text1"/>
+        </w:rPr>
+        <w:t xml:space="preserve"> is used to move or to rename a file if it’s a file name followed by another file name then we did a rename but if it’s a file name followed by a directory then it’s a move</w:t>
+      </w:r>
+    </w:p>
+    <w:p>
+      <w:pPr>
+        <w:pStyle w:val="ListParagraph"/>
+        <w:numPr>
+          <w:ilvl w:val="0"/>
+          <w:numId w:val="1"/>
+        </w:numPr>
+        <w:rPr>
+          <w:color w:val="000000" w:themeColor="text1"/>
+        </w:rPr>
+      </w:pPr>
+      <w:r>
+        <w:rPr>
+          <w:b/>
+          <w:bCs/>
+          <w:color w:val="000000" w:themeColor="text1"/>
+        </w:rPr>
+        <w:t>rm</w:t>
+      </w:r>
+      <w:r>
+        <w:rPr>
+          <w:color w:val="000000" w:themeColor="text1"/>
+        </w:rPr>
+        <w:t xml:space="preserve"> is for file and </w:t>
+      </w:r>
+      <w:r>
+        <w:rPr>
+          <w:b/>
+          <w:bCs/>
+          <w:color w:val="000000" w:themeColor="text1"/>
+        </w:rPr>
+        <w:t>rm -r</w:t>
+      </w:r>
+      <w:r>
+        <w:rPr>
+          <w:color w:val="000000" w:themeColor="text1"/>
+        </w:rPr>
+        <w:t xml:space="preserve"> is for directory</w:t>
+      </w:r>
+      <w:r>
+        <w:rPr>
+          <w:color w:val="000000" w:themeColor="text1"/>
+        </w:rPr>
+        <w:t xml:space="preserve">. The flag </w:t>
+      </w:r>
+      <w:r>
+        <w:rPr>
+          <w:b/>
+          <w:bCs/>
+          <w:color w:val="000000" w:themeColor="text1"/>
+        </w:rPr>
+        <w:t>-r</w:t>
+      </w:r>
+      <w:r>
+        <w:rPr>
+          <w:color w:val="000000" w:themeColor="text1"/>
+        </w:rPr>
+        <w:t xml:space="preserve"> means delete recursively.</w:t>
+      </w:r>
+    </w:p>
+    <w:p>
+      <w:pPr>
+        <w:pStyle w:val="ListParagraph"/>
+        <w:numPr>
+          <w:ilvl w:val="0"/>
+          <w:numId w:val="1"/>
+        </w:numPr>
+        <w:rPr>
+          <w:color w:val="000000" w:themeColor="text1"/>
+        </w:rPr>
+      </w:pPr>
+      <w:r>
+        <w:rPr>
+          <w:b/>
+          <w:bCs/>
+          <w:color w:val="000000" w:themeColor="text1"/>
+        </w:rPr>
+        <w:lastRenderedPageBreak/>
+        <w:t xml:space="preserve">cp </w:t>
+      </w:r>
+      <w:r>
+        <w:rPr>
+          <w:b/>
+          <w:bCs/>
+          <w:color w:val="000000" w:themeColor="text1"/>
+        </w:rPr>
+        <w:sym w:font="Wingdings" w:char="F0E0"/>
+      </w:r>
+      <w:r>
+        <w:rPr>
+          <w:b/>
+          <w:bCs/>
+          <w:color w:val="000000" w:themeColor="text1"/>
+        </w:rPr>
+        <w:t xml:space="preserve"> </w:t>
+      </w:r>
+      <w:r>
+        <w:rPr>
+          <w:color w:val="000000" w:themeColor="text1"/>
+        </w:rPr>
+        <w:t xml:space="preserve">cp file.txt new file.txt </w:t>
+      </w:r>
+      <w:r>
+        <w:rPr>
+          <w:color w:val="000000" w:themeColor="text1"/>
+        </w:rPr>
+        <w:sym w:font="Wingdings" w:char="F0E0"/>
+      </w:r>
+      <w:r>
+        <w:rPr>
+          <w:color w:val="000000" w:themeColor="text1"/>
+        </w:rPr>
+        <w:t xml:space="preserve"> this command here lets us copy a file into a new file. And we can do cp file.txt Directory </w:t>
+      </w:r>
+      <w:r>
+        <w:rPr>
+          <w:color w:val="000000" w:themeColor="text1"/>
+        </w:rPr>
+        <w:sym w:font="Wingdings" w:char="F0E0"/>
+      </w:r>
+      <w:r>
+        <w:rPr>
+          <w:color w:val="000000" w:themeColor="text1"/>
+        </w:rPr>
+        <w:t xml:space="preserve"> this lets us copy a file into a new directory. Cp -R lets us copy the directory itself</w:t>
+      </w:r>
+    </w:p>
+    <w:p>
+      <w:pPr>
+        <w:pStyle w:val="ListParagraph"/>
+        <w:numPr>
+          <w:ilvl w:val="0"/>
+          <w:numId w:val="1"/>
+        </w:numPr>
+        <w:rPr>
+          <w:color w:val="000000" w:themeColor="text1"/>
+        </w:rPr>
+      </w:pPr>
+      <w:r>
+        <w:rPr>
+          <w:b/>
+          <w:bCs/>
+          <w:color w:val="000000" w:themeColor="text1"/>
+        </w:rPr>
+        <w:t>/ is the root and ~ is the home</w:t>
+      </w:r>
+    </w:p>
+    <w:p>
+      <w:pPr>
+        <w:pStyle w:val="ListParagraph"/>
+        <w:numPr>
+          <w:ilvl w:val="0"/>
+          <w:numId w:val="1"/>
+        </w:numPr>
+        <w:rPr>
+          <w:color w:val="000000" w:themeColor="text1"/>
+        </w:rPr>
+      </w:pPr>
+      <w:r>
+        <w:rPr>
+          <w:b/>
+          <w:bCs/>
+          <w:color w:val="000000" w:themeColor="text1"/>
+        </w:rPr>
+        <w:t xml:space="preserve">grep ‘text’ file.txt </w:t>
+      </w:r>
+      <w:r>
+        <w:rPr>
+          <w:b/>
+          <w:bCs/>
+          <w:color w:val="000000" w:themeColor="text1"/>
+        </w:rPr>
+        <w:sym w:font="Wingdings" w:char="F0E0"/>
+      </w:r>
+      <w:r>
+        <w:rPr>
+          <w:b/>
+          <w:bCs/>
+          <w:color w:val="000000" w:themeColor="text1"/>
+        </w:rPr>
+        <w:t xml:space="preserve"> </w:t>
+      </w:r>
+      <w:r>
+        <w:rPr>
+          <w:color w:val="000000" w:themeColor="text1"/>
+        </w:rPr>
+        <w:t>this command searches a file for a certain text and return the entire line inside the file</w:t>
+      </w:r>
+    </w:p>
+    <w:p>
+      <w:pPr>
+        <w:pStyle w:val="ListParagraph"/>
+        <w:numPr>
+          <w:ilvl w:val="0"/>
+          <w:numId w:val="1"/>
+        </w:numPr>
+        <w:rPr>
+          <w:color w:val="000000" w:themeColor="text1"/>
+        </w:rPr>
+      </w:pPr>
+      <w:r>
+        <w:rPr>
+          <w:b/>
+          <w:bCs/>
+          <w:color w:val="000000" w:themeColor="text1"/>
+        </w:rPr>
+        <w:t xml:space="preserve">grep -r ‘test’ </w:t>
+      </w:r>
+      <w:proofErr w:type="spellStart"/>
+      <w:r>
+        <w:rPr>
+          <w:b/>
+          <w:bCs/>
+          <w:color w:val="000000" w:themeColor="text1"/>
+        </w:rPr>
+        <w:t>dir</w:t>
+      </w:r>
+      <w:proofErr w:type="spellEnd"/>
+      <w:r>
+        <w:rPr>
+          <w:b/>
+          <w:bCs/>
+          <w:color w:val="000000" w:themeColor="text1"/>
+        </w:rPr>
+        <w:t xml:space="preserve"> </w:t>
+      </w:r>
+      <w:r>
+        <w:rPr>
+          <w:b/>
+          <w:bCs/>
+          <w:color w:val="000000" w:themeColor="text1"/>
+        </w:rPr>
+        <w:sym w:font="Wingdings" w:char="F0E0"/>
+      </w:r>
+      <w:r>
+        <w:rPr>
+          <w:b/>
+          <w:bCs/>
+          <w:color w:val="000000" w:themeColor="text1"/>
+        </w:rPr>
+        <w:t xml:space="preserve"> </w:t>
+      </w:r>
+      <w:r>
+        <w:rPr>
+          <w:color w:val="000000" w:themeColor="text1"/>
+        </w:rPr>
+        <w:t>this lets us search the entire directory</w:t>
+      </w:r>
+    </w:p>
+    <w:p>
+      <w:pPr>
+        <w:pStyle w:val="ListParagraph"/>
+        <w:numPr>
+          <w:ilvl w:val="0"/>
+          <w:numId w:val="1"/>
+        </w:numPr>
+        <w:rPr>
+          <w:b/>
+          <w:bCs/>
+          <w:color w:val="000000" w:themeColor="text1"/>
+        </w:rPr>
+      </w:pPr>
+      <w:r>
+        <w:rPr>
+          <w:color w:val="000000" w:themeColor="text1"/>
+        </w:rPr>
+        <w:t>find is used to find files and directories</w:t>
+      </w:r>
+      <w:r>
+        <w:rPr>
+          <w:color w:val="000000" w:themeColor="text1"/>
+        </w:rPr>
+        <w:sym w:font="Wingdings" w:char="F0E0"/>
+      </w:r>
+      <w:r>
+        <w:rPr>
+          <w:color w:val="000000" w:themeColor="text1"/>
+        </w:rPr>
+        <w:t xml:space="preserve"> </w:t>
+      </w:r>
+      <w:r>
+        <w:rPr>
+          <w:b/>
+          <w:bCs/>
+          <w:color w:val="000000" w:themeColor="text1"/>
+        </w:rPr>
+        <w:t>find . -type d/f -name “</w:t>
+      </w:r>
+      <w:proofErr w:type="spellStart"/>
+      <w:r>
+        <w:rPr>
+          <w:b/>
+          <w:bCs/>
+          <w:color w:val="000000" w:themeColor="text1"/>
+        </w:rPr>
+        <w:t>file_name</w:t>
+      </w:r>
+      <w:proofErr w:type="spellEnd"/>
+      <w:r>
+        <w:rPr>
+          <w:b/>
+          <w:bCs/>
+          <w:color w:val="000000" w:themeColor="text1"/>
+        </w:rPr>
+        <w:t>/</w:t>
+      </w:r>
+      <w:proofErr w:type="spellStart"/>
+      <w:r>
+        <w:rPr>
+          <w:b/>
+          <w:bCs/>
+          <w:color w:val="000000" w:themeColor="text1"/>
+        </w:rPr>
+        <w:t>directory_name</w:t>
+      </w:r>
+      <w:proofErr w:type="spellEnd"/>
+      <w:r>
+        <w:rPr>
+          <w:b/>
+          <w:bCs/>
+          <w:color w:val="000000" w:themeColor="text1"/>
+        </w:rPr>
+        <w:t>”</w:t>
+      </w:r>
+      <w:r>
+        <w:rPr>
+          <w:b/>
+          <w:bCs/>
+          <w:color w:val="000000" w:themeColor="text1"/>
+        </w:rPr>
+        <w:t xml:space="preserve">  </w:t>
+      </w:r>
+      <w:r>
+        <w:rPr>
+          <w:color w:val="000000" w:themeColor="text1"/>
+        </w:rPr>
+        <w:t>d/f directory/file</w:t>
+      </w:r>
+    </w:p>
+    <w:p>
+      <w:pPr>
+        <w:pStyle w:val="ListParagraph"/>
+        <w:numPr>
+          <w:ilvl w:val="0"/>
+          <w:numId w:val="1"/>
+        </w:numPr>
+        <w:rPr>
+          <w:b/>
+          <w:bCs/>
+          <w:color w:val="000000" w:themeColor="text1"/>
+        </w:rPr>
+      </w:pPr>
     </w:p>
     <w:sectPr>
       <w:pgSz w:w="12240" w:h="15840"/>
@@ -1037,7 +2118,6 @@
   <w:style w:type="character" w:default="1" w:styleId="DefaultParagraphFont">
     <w:name w:val="Default Paragraph Font"/>
     <w:uiPriority w:val="1"/>
-    <w:semiHidden/>
     <w:unhideWhenUsed/>
   </w:style>
   <w:style w:type="table" w:default="1" w:styleId="TableNormal">

</xml_diff>

<commit_message>
add curl notes for linux
</commit_message>
<xml_diff>
--- a/Linux/Notes.docx
+++ b/Linux/Notes.docx
@@ -42,8 +42,19 @@
           <w:color w:val="000000" w:themeColor="text1"/>
           <w:u w:val="single"/>
         </w:rPr>
-        <w:t>Commands and what do they mean?:</w:t>
-      </w:r>
+        <w:t xml:space="preserve">Commands and what do they </w:t>
+      </w:r>
+      <w:proofErr w:type="gramStart"/>
+      <w:r>
+        <w:rPr>
+          <w:b/>
+          <w:bCs/>
+          <w:color w:val="000000" w:themeColor="text1"/>
+          <w:u w:val="single"/>
+        </w:rPr>
+        <w:t>mean?:</w:t>
+      </w:r>
+      <w:proofErr w:type="gramEnd"/>
     </w:p>
     <w:p>
       <w:pPr>
@@ -186,11 +197,47 @@
           <w:color w:val="000000" w:themeColor="text1"/>
         </w:rPr>
       </w:pPr>
-      <w:r>
-        <w:rPr>
-          <w:color w:val="000000" w:themeColor="text1"/>
-        </w:rPr>
-        <w:t xml:space="preserve">we can set a variable normally for example </w:t>
+      <w:proofErr w:type="gramStart"/>
+      <w:r>
+        <w:rPr>
+          <w:color w:val="000000" w:themeColor="text1"/>
+        </w:rPr>
+        <w:t>we</w:t>
+      </w:r>
+      <w:proofErr w:type="gramEnd"/>
+      <w:r>
+        <w:rPr>
+          <w:color w:val="000000" w:themeColor="text1"/>
+        </w:rPr>
+        <w:t xml:space="preserve"> can set a variable </w:t>
+      </w:r>
+      <w:proofErr w:type="gramStart"/>
+      <w:r>
+        <w:rPr>
+          <w:color w:val="000000" w:themeColor="text1"/>
+        </w:rPr>
+        <w:t>normally</w:t>
+      </w:r>
+      <w:proofErr w:type="gramEnd"/>
+      <w:r>
+        <w:rPr>
+          <w:color w:val="000000" w:themeColor="text1"/>
+        </w:rPr>
+        <w:t xml:space="preserve"> for </w:t>
+      </w:r>
+      <w:proofErr w:type="gramStart"/>
+      <w:r>
+        <w:rPr>
+          <w:color w:val="000000" w:themeColor="text1"/>
+        </w:rPr>
+        <w:t>example</w:t>
+      </w:r>
+      <w:proofErr w:type="gramEnd"/>
+      <w:r>
+        <w:rPr>
+          <w:color w:val="000000" w:themeColor="text1"/>
+        </w:rPr>
+        <w:t xml:space="preserve"> </w:t>
       </w:r>
       <w:r>
         <w:rPr>
@@ -220,6 +267,7 @@
         </w:rPr>
         <w:t>john</w:t>
       </w:r>
+      <w:proofErr w:type="gramStart"/>
       <w:r>
         <w:rPr>
           <w:b/>
@@ -238,7 +286,28 @@
         <w:rPr>
           <w:color w:val="000000" w:themeColor="text1"/>
         </w:rPr>
-        <w:t>, it important to include no spaces in between</w:t>
+        <w:t>,</w:t>
+      </w:r>
+      <w:proofErr w:type="gramEnd"/>
+      <w:r>
+        <w:rPr>
+          <w:color w:val="000000" w:themeColor="text1"/>
+        </w:rPr>
+        <w:t xml:space="preserve"> it </w:t>
+      </w:r>
+      <w:proofErr w:type="gramStart"/>
+      <w:r>
+        <w:rPr>
+          <w:color w:val="000000" w:themeColor="text1"/>
+        </w:rPr>
+        <w:t>important</w:t>
+      </w:r>
+      <w:proofErr w:type="gramEnd"/>
+      <w:r>
+        <w:rPr>
+          <w:color w:val="000000" w:themeColor="text1"/>
+        </w:rPr>
+        <w:t xml:space="preserve"> to include no spaces in between</w:t>
       </w:r>
     </w:p>
     <w:p>
@@ -334,11 +403,19 @@
           <w:color w:val="000000" w:themeColor="text1"/>
         </w:rPr>
       </w:pPr>
-      <w:r>
-        <w:rPr>
-          <w:color w:val="000000" w:themeColor="text1"/>
-        </w:rPr>
-        <w:t xml:space="preserve">writing </w:t>
+      <w:proofErr w:type="gramStart"/>
+      <w:r>
+        <w:rPr>
+          <w:color w:val="000000" w:themeColor="text1"/>
+        </w:rPr>
+        <w:t>writing</w:t>
+      </w:r>
+      <w:proofErr w:type="gramEnd"/>
+      <w:r>
+        <w:rPr>
+          <w:color w:val="000000" w:themeColor="text1"/>
+        </w:rPr>
+        <w:t xml:space="preserve"> </w:t>
       </w:r>
       <w:r>
         <w:rPr>
@@ -448,11 +525,33 @@
           <w:color w:val="000000" w:themeColor="text1"/>
         </w:rPr>
       </w:pPr>
-      <w:r>
-        <w:rPr>
-          <w:color w:val="000000" w:themeColor="text1"/>
-        </w:rPr>
-        <w:t>the file called bin inside our root is not standing for trash bin. It starts for binaries which all the commands are stored.</w:t>
+      <w:proofErr w:type="gramStart"/>
+      <w:r>
+        <w:rPr>
+          <w:color w:val="000000" w:themeColor="text1"/>
+        </w:rPr>
+        <w:t>the</w:t>
+      </w:r>
+      <w:proofErr w:type="gramEnd"/>
+      <w:r>
+        <w:rPr>
+          <w:color w:val="000000" w:themeColor="text1"/>
+        </w:rPr>
+        <w:t xml:space="preserve"> file called bin inside our root is not standing for trash bin. It starts </w:t>
+      </w:r>
+      <w:proofErr w:type="gramStart"/>
+      <w:r>
+        <w:rPr>
+          <w:color w:val="000000" w:themeColor="text1"/>
+        </w:rPr>
+        <w:t>for</w:t>
+      </w:r>
+      <w:proofErr w:type="gramEnd"/>
+      <w:r>
+        <w:rPr>
+          <w:color w:val="000000" w:themeColor="text1"/>
+        </w:rPr>
+        <w:t xml:space="preserve"> binaries which all the commands are stored.</w:t>
       </w:r>
     </w:p>
     <w:p>
@@ -470,7 +569,35 @@
         <w:rPr>
           <w:color w:val="000000" w:themeColor="text1"/>
         </w:rPr>
-        <w:t>Absolute path which start with / tells the system where a file or a directory are located from the root while a relative path which does not start with / tells the system where the file is from where we are at that exact moment</w:t>
+        <w:t xml:space="preserve">Absolute path which </w:t>
+      </w:r>
+      <w:proofErr w:type="gramStart"/>
+      <w:r>
+        <w:rPr>
+          <w:color w:val="000000" w:themeColor="text1"/>
+        </w:rPr>
+        <w:t>start</w:t>
+      </w:r>
+      <w:proofErr w:type="gramEnd"/>
+      <w:r>
+        <w:rPr>
+          <w:color w:val="000000" w:themeColor="text1"/>
+        </w:rPr>
+        <w:t xml:space="preserve"> with / tells the system where a file or a directory </w:t>
+      </w:r>
+      <w:proofErr w:type="gramStart"/>
+      <w:r>
+        <w:rPr>
+          <w:color w:val="000000" w:themeColor="text1"/>
+        </w:rPr>
+        <w:t>are</w:t>
+      </w:r>
+      <w:proofErr w:type="gramEnd"/>
+      <w:r>
+        <w:rPr>
+          <w:color w:val="000000" w:themeColor="text1"/>
+        </w:rPr>
+        <w:t xml:space="preserve"> located from the root while a relative path which does not start with / tells the system where the file is from where we are at that exact moment</w:t>
       </w:r>
     </w:p>
     <w:p>
@@ -504,7 +631,21 @@
         <w:rPr>
           <w:color w:val="000000" w:themeColor="text1"/>
         </w:rPr>
-        <w:t xml:space="preserve"> this command print a file to the terminal, and it stands for concatenate where we can write cat file.txt file2.txt and it will print them concatenated.</w:t>
+        <w:t xml:space="preserve"> this command </w:t>
+      </w:r>
+      <w:proofErr w:type="gramStart"/>
+      <w:r>
+        <w:rPr>
+          <w:color w:val="000000" w:themeColor="text1"/>
+        </w:rPr>
+        <w:t>print</w:t>
+      </w:r>
+      <w:proofErr w:type="gramEnd"/>
+      <w:r>
+        <w:rPr>
+          <w:color w:val="000000" w:themeColor="text1"/>
+        </w:rPr>
+        <w:t xml:space="preserve"> a file to the terminal, and it stands for concatenate where we can write cat file.txt file2.txt and it will print them concatenated.</w:t>
       </w:r>
     </w:p>
     <w:p>
@@ -678,7 +819,21 @@
         <w:rPr>
           <w:color w:val="000000" w:themeColor="text1"/>
         </w:rPr>
-        <w:t xml:space="preserve"> Its more powerful and preferred </w:t>
+        <w:t xml:space="preserve"> </w:t>
+      </w:r>
+      <w:proofErr w:type="gramStart"/>
+      <w:r>
+        <w:rPr>
+          <w:color w:val="000000" w:themeColor="text1"/>
+        </w:rPr>
+        <w:t>Its</w:t>
+      </w:r>
+      <w:proofErr w:type="gramEnd"/>
+      <w:r>
+        <w:rPr>
+          <w:color w:val="000000" w:themeColor="text1"/>
+        </w:rPr>
+        <w:t xml:space="preserve"> more powerful and preferred </w:t>
       </w:r>
     </w:p>
     <w:p>
@@ -872,7 +1027,21 @@
         <w:rPr>
           <w:color w:val="000000" w:themeColor="text1"/>
         </w:rPr>
-        <w:t xml:space="preserve"> If it does not exist then create the file</w:t>
+        <w:t xml:space="preserve"> If it does not </w:t>
+      </w:r>
+      <w:proofErr w:type="gramStart"/>
+      <w:r>
+        <w:rPr>
+          <w:color w:val="000000" w:themeColor="text1"/>
+        </w:rPr>
+        <w:t>exist</w:t>
+      </w:r>
+      <w:proofErr w:type="gramEnd"/>
+      <w:r>
+        <w:rPr>
+          <w:color w:val="000000" w:themeColor="text1"/>
+        </w:rPr>
+        <w:t xml:space="preserve"> then create the file</w:t>
       </w:r>
       <w:r>
         <w:rPr>
@@ -1159,7 +1328,25 @@
           <w:bCs/>
           <w:color w:val="000000" w:themeColor="text1"/>
         </w:rPr>
-        <w:t>/ is the root and ~ is the home</w:t>
+        <w:t xml:space="preserve">/ </w:t>
+      </w:r>
+      <w:proofErr w:type="gramStart"/>
+      <w:r>
+        <w:rPr>
+          <w:b/>
+          <w:bCs/>
+          <w:color w:val="000000" w:themeColor="text1"/>
+        </w:rPr>
+        <w:t>is</w:t>
+      </w:r>
+      <w:proofErr w:type="gramEnd"/>
+      <w:r>
+        <w:rPr>
+          <w:b/>
+          <w:bCs/>
+          <w:color w:val="000000" w:themeColor="text1"/>
+        </w:rPr>
+        <w:t xml:space="preserve"> the root and ~ is the home</w:t>
       </w:r>
     </w:p>
     <w:p>
@@ -1201,7 +1388,21 @@
         <w:rPr>
           <w:color w:val="000000" w:themeColor="text1"/>
         </w:rPr>
-        <w:t>this command searches a file for a certain text and return the entire line inside the file</w:t>
+        <w:t xml:space="preserve">this command searches a file for a certain text and </w:t>
+      </w:r>
+      <w:proofErr w:type="gramStart"/>
+      <w:r>
+        <w:rPr>
+          <w:color w:val="000000" w:themeColor="text1"/>
+        </w:rPr>
+        <w:t>return</w:t>
+      </w:r>
+      <w:proofErr w:type="gramEnd"/>
+      <w:r>
+        <w:rPr>
+          <w:color w:val="000000" w:themeColor="text1"/>
+        </w:rPr>
+        <w:t xml:space="preserve"> the entire line inside the file</w:t>
       </w:r>
     </w:p>
     <w:p>
@@ -1295,13 +1496,23 @@
         </w:rPr>
         <w:t xml:space="preserve"> </w:t>
       </w:r>
-      <w:r>
-        <w:rPr>
-          <w:b/>
-          <w:bCs/>
-          <w:color w:val="000000" w:themeColor="text1"/>
-        </w:rPr>
-        <w:t>find . -type d/f -name “</w:t>
+      <w:proofErr w:type="gramStart"/>
+      <w:r>
+        <w:rPr>
+          <w:b/>
+          <w:bCs/>
+          <w:color w:val="000000" w:themeColor="text1"/>
+        </w:rPr>
+        <w:t>find .</w:t>
+      </w:r>
+      <w:proofErr w:type="gramEnd"/>
+      <w:r>
+        <w:rPr>
+          <w:b/>
+          <w:bCs/>
+          <w:color w:val="000000" w:themeColor="text1"/>
+        </w:rPr>
+        <w:t xml:space="preserve"> -type d/f -name “</w:t>
       </w:r>
       <w:proofErr w:type="spellStart"/>
       <w:r>
@@ -1328,7 +1539,16 @@
           <w:bCs/>
           <w:color w:val="000000" w:themeColor="text1"/>
         </w:rPr>
-        <w:t>directory_name</w:t>
+        <w:t>directory_</w:t>
+      </w:r>
+      <w:proofErr w:type="gramStart"/>
+      <w:r>
+        <w:rPr>
+          <w:b/>
+          <w:bCs/>
+          <w:color w:val="000000" w:themeColor="text1"/>
+        </w:rPr>
+        <w:t>name</w:t>
       </w:r>
       <w:proofErr w:type="spellEnd"/>
       <w:r>
@@ -1351,7 +1571,14 @@
         <w:rPr>
           <w:color w:val="000000" w:themeColor="text1"/>
         </w:rPr>
-        <w:t>d/f directory/file</w:t>
+        <w:t>d</w:t>
+      </w:r>
+      <w:proofErr w:type="gramEnd"/>
+      <w:r>
+        <w:rPr>
+          <w:color w:val="000000" w:themeColor="text1"/>
+        </w:rPr>
+        <w:t>/f directory/file</w:t>
       </w:r>
     </w:p>
     <w:p>
@@ -1367,13 +1594,23 @@
           <w:color w:val="000000" w:themeColor="text1"/>
         </w:rPr>
       </w:pPr>
-      <w:r>
-        <w:rPr>
-          <w:b/>
-          <w:bCs/>
-          <w:color w:val="000000" w:themeColor="text1"/>
-        </w:rPr>
-        <w:t xml:space="preserve">writing </w:t>
+      <w:proofErr w:type="gramStart"/>
+      <w:r>
+        <w:rPr>
+          <w:b/>
+          <w:bCs/>
+          <w:color w:val="000000" w:themeColor="text1"/>
+        </w:rPr>
+        <w:t>writing</w:t>
+      </w:r>
+      <w:proofErr w:type="gramEnd"/>
+      <w:r>
+        <w:rPr>
+          <w:b/>
+          <w:bCs/>
+          <w:color w:val="000000" w:themeColor="text1"/>
+        </w:rPr>
+        <w:t xml:space="preserve"> </w:t>
       </w:r>
       <w:proofErr w:type="spellStart"/>
       <w:r>
@@ -1407,11 +1644,33 @@
           <w:color w:val="000000" w:themeColor="text1"/>
         </w:rPr>
       </w:pPr>
-      <w:r>
-        <w:rPr>
-          <w:color w:val="000000" w:themeColor="text1"/>
-        </w:rPr>
-        <w:t xml:space="preserve">the permission is split into 3 types owner, group, other the permissions for them are -/d </w:t>
+      <w:proofErr w:type="gramStart"/>
+      <w:r>
+        <w:rPr>
+          <w:color w:val="000000" w:themeColor="text1"/>
+        </w:rPr>
+        <w:t>the</w:t>
+      </w:r>
+      <w:proofErr w:type="gramEnd"/>
+      <w:r>
+        <w:rPr>
+          <w:color w:val="000000" w:themeColor="text1"/>
+        </w:rPr>
+        <w:t xml:space="preserve"> permission is split into 3 </w:t>
+      </w:r>
+      <w:proofErr w:type="gramStart"/>
+      <w:r>
+        <w:rPr>
+          <w:color w:val="000000" w:themeColor="text1"/>
+        </w:rPr>
+        <w:t>types</w:t>
+      </w:r>
+      <w:proofErr w:type="gramEnd"/>
+      <w:r>
+        <w:rPr>
+          <w:color w:val="000000" w:themeColor="text1"/>
+        </w:rPr>
+        <w:t xml:space="preserve"> owner, group, other the permissions for them are -/d </w:t>
       </w:r>
       <w:proofErr w:type="spellStart"/>
       <w:r>
@@ -1693,11 +1952,33 @@
           <w:color w:val="000000" w:themeColor="text1"/>
         </w:rPr>
       </w:pPr>
-      <w:r>
-        <w:rPr>
-          <w:color w:val="000000" w:themeColor="text1"/>
-        </w:rPr>
-        <w:t xml:space="preserve">the root user is a super they have access to everything on the system and can do anything on the system. </w:t>
+      <w:proofErr w:type="gramStart"/>
+      <w:r>
+        <w:rPr>
+          <w:color w:val="000000" w:themeColor="text1"/>
+        </w:rPr>
+        <w:t>the</w:t>
+      </w:r>
+      <w:proofErr w:type="gramEnd"/>
+      <w:r>
+        <w:rPr>
+          <w:color w:val="000000" w:themeColor="text1"/>
+        </w:rPr>
+        <w:t xml:space="preserve"> root user is </w:t>
+      </w:r>
+      <w:proofErr w:type="gramStart"/>
+      <w:r>
+        <w:rPr>
+          <w:color w:val="000000" w:themeColor="text1"/>
+        </w:rPr>
+        <w:t>a super</w:t>
+      </w:r>
+      <w:proofErr w:type="gramEnd"/>
+      <w:r>
+        <w:rPr>
+          <w:color w:val="000000" w:themeColor="text1"/>
+        </w:rPr>
+        <w:t xml:space="preserve"> they have access to everything on the system and can do anything on the system. </w:t>
       </w:r>
       <w:r>
         <w:rPr>
@@ -2112,7 +2393,25 @@
           <w:sz w:val="22"/>
           <w:szCs w:val="22"/>
         </w:rPr>
-        <w:t>You can run the executable: ./hello</w:t>
+        <w:t>You can run the executable</w:t>
+      </w:r>
+      <w:proofErr w:type="gramStart"/>
+      <w:r>
+        <w:rPr>
+          <w:color w:val="000000" w:themeColor="text1"/>
+          <w:sz w:val="22"/>
+          <w:szCs w:val="22"/>
+        </w:rPr>
+        <w:t>: .</w:t>
+      </w:r>
+      <w:proofErr w:type="gramEnd"/>
+      <w:r>
+        <w:rPr>
+          <w:color w:val="000000" w:themeColor="text1"/>
+          <w:sz w:val="22"/>
+          <w:szCs w:val="22"/>
+        </w:rPr>
+        <w:t>/hello</w:t>
       </w:r>
     </w:p>
     <w:p>
@@ -2156,7 +2455,25 @@
           <w:sz w:val="22"/>
           <w:szCs w:val="22"/>
         </w:rPr>
-        <w:t>We run a compiled program by writing ./</w:t>
+        <w:t xml:space="preserve">We run a compiled program by </w:t>
+      </w:r>
+      <w:proofErr w:type="gramStart"/>
+      <w:r>
+        <w:rPr>
+          <w:color w:val="000000" w:themeColor="text1"/>
+          <w:sz w:val="22"/>
+          <w:szCs w:val="22"/>
+        </w:rPr>
+        <w:t>writing .</w:t>
+      </w:r>
+      <w:proofErr w:type="gramEnd"/>
+      <w:r>
+        <w:rPr>
+          <w:color w:val="000000" w:themeColor="text1"/>
+          <w:sz w:val="22"/>
+          <w:szCs w:val="22"/>
+        </w:rPr>
+        <w:t>/</w:t>
       </w:r>
       <w:proofErr w:type="spellStart"/>
       <w:r>
@@ -2188,7 +2505,25 @@
           <w:sz w:val="22"/>
           <w:szCs w:val="22"/>
         </w:rPr>
-        <w:t xml:space="preserve">For interpreted programs like python or shell we don’t compile them instead we write the interpreter name before the file name so </w:t>
+        <w:t xml:space="preserve">For interpreted programs like python or shell we don’t compile them instead we write the </w:t>
+      </w:r>
+      <w:proofErr w:type="gramStart"/>
+      <w:r>
+        <w:rPr>
+          <w:color w:val="000000" w:themeColor="text1"/>
+          <w:sz w:val="22"/>
+          <w:szCs w:val="22"/>
+        </w:rPr>
+        <w:t>interpreter</w:t>
+      </w:r>
+      <w:proofErr w:type="gramEnd"/>
+      <w:r>
+        <w:rPr>
+          <w:color w:val="000000" w:themeColor="text1"/>
+          <w:sz w:val="22"/>
+          <w:szCs w:val="22"/>
+        </w:rPr>
+        <w:t xml:space="preserve"> name before the file name so </w:t>
       </w:r>
       <w:r>
         <w:rPr>
@@ -2214,6 +2549,7 @@
           <w:szCs w:val="22"/>
         </w:rPr>
       </w:pPr>
+      <w:proofErr w:type="gramStart"/>
       <w:r>
         <w:rPr>
           <w:color w:val="000000" w:themeColor="text1"/>
@@ -2231,7 +2567,18 @@
           <w:sz w:val="22"/>
           <w:szCs w:val="22"/>
         </w:rPr>
-        <w:t>./</w:t>
+        <w:t>.</w:t>
+      </w:r>
+      <w:proofErr w:type="gramEnd"/>
+      <w:r>
+        <w:rPr>
+          <w:b/>
+          <w:bCs/>
+          <w:color w:val="000000" w:themeColor="text1"/>
+          <w:sz w:val="22"/>
+          <w:szCs w:val="22"/>
+        </w:rPr>
+        <w:t>/</w:t>
       </w:r>
       <w:proofErr w:type="spellStart"/>
       <w:r>
@@ -2297,7 +2644,25 @@
           <w:sz w:val="22"/>
           <w:szCs w:val="22"/>
         </w:rPr>
-        <w:t xml:space="preserve"> has to be a compiled file not a file including code in a compiled language</w:t>
+        <w:t xml:space="preserve"> </w:t>
+      </w:r>
+      <w:proofErr w:type="gramStart"/>
+      <w:r>
+        <w:rPr>
+          <w:color w:val="000000" w:themeColor="text1"/>
+          <w:sz w:val="22"/>
+          <w:szCs w:val="22"/>
+        </w:rPr>
+        <w:t>has to</w:t>
+      </w:r>
+      <w:proofErr w:type="gramEnd"/>
+      <w:r>
+        <w:rPr>
+          <w:color w:val="000000" w:themeColor="text1"/>
+          <w:sz w:val="22"/>
+          <w:szCs w:val="22"/>
+        </w:rPr>
+        <w:t xml:space="preserve"> be a compiled file not a file including code in a compiled language</w:t>
       </w:r>
     </w:p>
     <w:p>
@@ -2355,15 +2720,27 @@
           <w:szCs w:val="22"/>
         </w:rPr>
       </w:pPr>
-      <w:r>
-        <w:rPr>
-          <w:b/>
-          <w:bCs/>
-          <w:color w:val="000000" w:themeColor="text1"/>
-          <w:sz w:val="22"/>
-          <w:szCs w:val="22"/>
-        </w:rPr>
-        <w:t>#!/usr/bin/python3</w:t>
+      <w:proofErr w:type="gramStart"/>
+      <w:r>
+        <w:rPr>
+          <w:b/>
+          <w:bCs/>
+          <w:color w:val="000000" w:themeColor="text1"/>
+          <w:sz w:val="22"/>
+          <w:szCs w:val="22"/>
+        </w:rPr>
+        <w:t>#!/</w:t>
+      </w:r>
+      <w:proofErr w:type="gramEnd"/>
+      <w:r>
+        <w:rPr>
+          <w:b/>
+          <w:bCs/>
+          <w:color w:val="000000" w:themeColor="text1"/>
+          <w:sz w:val="22"/>
+          <w:szCs w:val="22"/>
+        </w:rPr>
+        <w:t>usr/bin/python3</w:t>
       </w:r>
       <w:r>
         <w:rPr>
@@ -2381,7 +2758,43 @@
           <w:sz w:val="22"/>
           <w:szCs w:val="22"/>
         </w:rPr>
-        <w:t>having this at the top of our python file or any interpreted file will give us the advantage of just writing ./python.py this shebang includes the interpreter and its location so we don’t need to specify the interpreter when writing the run command</w:t>
+        <w:t xml:space="preserve">having this at the top of our python file or any interpreted file will give us the advantage of just </w:t>
+      </w:r>
+      <w:proofErr w:type="gramStart"/>
+      <w:r>
+        <w:rPr>
+          <w:color w:val="000000" w:themeColor="text1"/>
+          <w:sz w:val="22"/>
+          <w:szCs w:val="22"/>
+        </w:rPr>
+        <w:t>writing .</w:t>
+      </w:r>
+      <w:proofErr w:type="gramEnd"/>
+      <w:r>
+        <w:rPr>
+          <w:color w:val="000000" w:themeColor="text1"/>
+          <w:sz w:val="22"/>
+          <w:szCs w:val="22"/>
+        </w:rPr>
+        <w:t xml:space="preserve">/python.py this shebang includes the interpreter and its </w:t>
+      </w:r>
+      <w:proofErr w:type="gramStart"/>
+      <w:r>
+        <w:rPr>
+          <w:color w:val="000000" w:themeColor="text1"/>
+          <w:sz w:val="22"/>
+          <w:szCs w:val="22"/>
+        </w:rPr>
+        <w:t>location</w:t>
+      </w:r>
+      <w:proofErr w:type="gramEnd"/>
+      <w:r>
+        <w:rPr>
+          <w:color w:val="000000" w:themeColor="text1"/>
+          <w:sz w:val="22"/>
+          <w:szCs w:val="22"/>
+        </w:rPr>
+        <w:t xml:space="preserve"> so we don’t need to specify the interpreter when writing the run command</w:t>
       </w:r>
     </w:p>
     <w:p>
@@ -2415,7 +2828,16 @@
           <w:sz w:val="22"/>
           <w:szCs w:val="22"/>
         </w:rPr>
-        <w:t xml:space="preserve">command in the ~ directory gives us all the system hidden files including the configuration files one example is </w:t>
+        <w:t xml:space="preserve">command in the ~ directory gives us all the system hidden files including the configuration files one example </w:t>
+      </w:r>
+      <w:proofErr w:type="gramStart"/>
+      <w:r>
+        <w:rPr>
+          <w:color w:val="000000" w:themeColor="text1"/>
+          <w:sz w:val="22"/>
+          <w:szCs w:val="22"/>
+        </w:rPr>
+        <w:t xml:space="preserve">is </w:t>
       </w:r>
       <w:r>
         <w:rPr>
@@ -2435,6 +2857,7 @@
         <w:t>bashrc</w:t>
       </w:r>
       <w:proofErr w:type="spellEnd"/>
+      <w:proofErr w:type="gramEnd"/>
       <w:r>
         <w:rPr>
           <w:color w:val="000000" w:themeColor="text1"/>
@@ -2495,6 +2918,888 @@
         </w:rPr>
         <w:t xml:space="preserve"> to read this environment variable </w:t>
       </w:r>
+    </w:p>
+    <w:p>
+      <w:pPr>
+        <w:pStyle w:val="ListParagraph"/>
+        <w:numPr>
+          <w:ilvl w:val="0"/>
+          <w:numId w:val="2"/>
+        </w:numPr>
+        <w:spacing w:before="100" w:beforeAutospacing="1" w:after="100" w:afterAutospacing="1" w:line="240" w:lineRule="auto"/>
+        <w:rPr>
+          <w:color w:val="000000" w:themeColor="text1"/>
+          <w:sz w:val="22"/>
+          <w:szCs w:val="22"/>
+        </w:rPr>
+      </w:pPr>
+      <w:r>
+        <w:rPr>
+          <w:color w:val="000000" w:themeColor="text1"/>
+          <w:sz w:val="22"/>
+          <w:szCs w:val="22"/>
+        </w:rPr>
+        <w:t>echo $PATH displays the contents of your PATH environment variable.</w:t>
+      </w:r>
+    </w:p>
+    <w:p>
+      <w:pPr>
+        <w:pStyle w:val="ListParagraph"/>
+        <w:numPr>
+          <w:ilvl w:val="0"/>
+          <w:numId w:val="2"/>
+        </w:numPr>
+        <w:rPr>
+          <w:color w:val="000000" w:themeColor="text1"/>
+          <w:sz w:val="22"/>
+          <w:szCs w:val="22"/>
+        </w:rPr>
+      </w:pPr>
+      <w:r>
+        <w:rPr>
+          <w:color w:val="000000" w:themeColor="text1"/>
+          <w:sz w:val="22"/>
+          <w:szCs w:val="22"/>
+        </w:rPr>
+        <w:t xml:space="preserve">What is </w:t>
+      </w:r>
+      <w:proofErr w:type="gramStart"/>
+      <w:r>
+        <w:rPr>
+          <w:color w:val="000000" w:themeColor="text1"/>
+          <w:sz w:val="22"/>
+          <w:szCs w:val="22"/>
+        </w:rPr>
+        <w:t>PATH?</w:t>
+      </w:r>
+      <w:r>
+        <w:rPr>
+          <w:color w:val="000000" w:themeColor="text1"/>
+          <w:sz w:val="22"/>
+          <w:szCs w:val="22"/>
+        </w:rPr>
+        <w:t>:</w:t>
+      </w:r>
+      <w:proofErr w:type="gramEnd"/>
+      <w:r>
+        <w:rPr>
+          <w:color w:val="000000" w:themeColor="text1"/>
+          <w:sz w:val="22"/>
+          <w:szCs w:val="22"/>
+        </w:rPr>
+        <w:t xml:space="preserve"> </w:t>
+      </w:r>
+      <w:r>
+        <w:rPr>
+          <w:color w:val="000000" w:themeColor="text1"/>
+          <w:sz w:val="22"/>
+          <w:szCs w:val="22"/>
+        </w:rPr>
+        <w:t>PATH is a list of directories where the shell looks for executable programs when you type a command.</w:t>
+      </w:r>
+    </w:p>
+    <w:p>
+      <w:pPr>
+        <w:pStyle w:val="ListParagraph"/>
+        <w:numPr>
+          <w:ilvl w:val="0"/>
+          <w:numId w:val="2"/>
+        </w:numPr>
+        <w:rPr>
+          <w:color w:val="000000" w:themeColor="text1"/>
+          <w:sz w:val="22"/>
+          <w:szCs w:val="22"/>
+        </w:rPr>
+      </w:pPr>
+      <w:r>
+        <w:rPr>
+          <w:color w:val="000000" w:themeColor="text1"/>
+          <w:sz w:val="22"/>
+          <w:szCs w:val="22"/>
+        </w:rPr>
+        <w:t>So, in one sentence: echo $PATH lets you see the directories Ubuntu searches when you enter a command.</w:t>
+      </w:r>
+    </w:p>
+    <w:p>
+      <w:pPr>
+        <w:pStyle w:val="ListParagraph"/>
+        <w:numPr>
+          <w:ilvl w:val="0"/>
+          <w:numId w:val="2"/>
+        </w:numPr>
+        <w:rPr>
+          <w:color w:val="000000" w:themeColor="text1"/>
+          <w:sz w:val="22"/>
+          <w:szCs w:val="22"/>
+        </w:rPr>
+      </w:pPr>
+      <w:r>
+        <w:rPr>
+          <w:color w:val="000000" w:themeColor="text1"/>
+          <w:sz w:val="22"/>
+          <w:szCs w:val="22"/>
+        </w:rPr>
+        <w:t xml:space="preserve">Writing </w:t>
+      </w:r>
+      <w:r>
+        <w:rPr>
+          <w:b/>
+          <w:bCs/>
+          <w:color w:val="000000" w:themeColor="text1"/>
+          <w:sz w:val="22"/>
+          <w:szCs w:val="22"/>
+        </w:rPr>
+        <w:t xml:space="preserve">PATH= </w:t>
+      </w:r>
+      <w:r>
+        <w:rPr>
+          <w:color w:val="000000" w:themeColor="text1"/>
+          <w:sz w:val="22"/>
+          <w:szCs w:val="22"/>
+        </w:rPr>
+        <w:t xml:space="preserve">“” </w:t>
+      </w:r>
+      <w:r>
+        <w:rPr>
+          <w:color w:val="000000" w:themeColor="text1"/>
+          <w:sz w:val="22"/>
+          <w:szCs w:val="22"/>
+        </w:rPr>
+        <w:t>you are setting the PATH environment variable to an empty string in your current shell.</w:t>
+      </w:r>
+      <w:r>
+        <w:rPr>
+          <w:color w:val="000000" w:themeColor="text1"/>
+          <w:sz w:val="22"/>
+          <w:szCs w:val="22"/>
+        </w:rPr>
+        <w:t xml:space="preserve"> That means when we write commands to </w:t>
+      </w:r>
+      <w:proofErr w:type="gramStart"/>
+      <w:r>
+        <w:rPr>
+          <w:color w:val="000000" w:themeColor="text1"/>
+          <w:sz w:val="22"/>
+          <w:szCs w:val="22"/>
+        </w:rPr>
+        <w:t>execute</w:t>
+      </w:r>
+      <w:proofErr w:type="gramEnd"/>
+      <w:r>
+        <w:rPr>
+          <w:color w:val="000000" w:themeColor="text1"/>
+          <w:sz w:val="22"/>
+          <w:szCs w:val="22"/>
+        </w:rPr>
+        <w:t xml:space="preserve"> we </w:t>
+      </w:r>
+      <w:proofErr w:type="gramStart"/>
+      <w:r>
+        <w:rPr>
+          <w:color w:val="000000" w:themeColor="text1"/>
+          <w:sz w:val="22"/>
+          <w:szCs w:val="22"/>
+        </w:rPr>
+        <w:t>have to</w:t>
+      </w:r>
+      <w:proofErr w:type="gramEnd"/>
+      <w:r>
+        <w:rPr>
+          <w:color w:val="000000" w:themeColor="text1"/>
+          <w:sz w:val="22"/>
+          <w:szCs w:val="22"/>
+        </w:rPr>
+        <w:t xml:space="preserve"> write </w:t>
+      </w:r>
+      <w:proofErr w:type="gramStart"/>
+      <w:r>
+        <w:rPr>
+          <w:color w:val="000000" w:themeColor="text1"/>
+          <w:sz w:val="22"/>
+          <w:szCs w:val="22"/>
+        </w:rPr>
+        <w:t>it</w:t>
+      </w:r>
+      <w:proofErr w:type="gramEnd"/>
+      <w:r>
+        <w:rPr>
+          <w:color w:val="000000" w:themeColor="text1"/>
+          <w:sz w:val="22"/>
+          <w:szCs w:val="22"/>
+        </w:rPr>
+        <w:t xml:space="preserve"> from the directory where they are located. Just writing ls command would not work</w:t>
+      </w:r>
+    </w:p>
+    <w:p>
+      <w:pPr>
+        <w:pStyle w:val="ListParagraph"/>
+        <w:numPr>
+          <w:ilvl w:val="0"/>
+          <w:numId w:val="2"/>
+        </w:numPr>
+        <w:rPr>
+          <w:color w:val="000000" w:themeColor="text1"/>
+          <w:sz w:val="22"/>
+          <w:szCs w:val="22"/>
+        </w:rPr>
+      </w:pPr>
+      <w:r>
+        <w:rPr>
+          <w:color w:val="000000" w:themeColor="text1"/>
+          <w:sz w:val="22"/>
+          <w:szCs w:val="22"/>
+        </w:rPr>
+        <w:t xml:space="preserve">To update the </w:t>
+      </w:r>
+      <w:proofErr w:type="gramStart"/>
+      <w:r>
+        <w:rPr>
+          <w:color w:val="000000" w:themeColor="text1"/>
+          <w:sz w:val="22"/>
+          <w:szCs w:val="22"/>
+        </w:rPr>
+        <w:t>PATH</w:t>
+      </w:r>
+      <w:proofErr w:type="gramEnd"/>
+      <w:r>
+        <w:rPr>
+          <w:color w:val="000000" w:themeColor="text1"/>
+          <w:sz w:val="22"/>
+          <w:szCs w:val="22"/>
+        </w:rPr>
+        <w:t xml:space="preserve"> we should write PATH = “$</w:t>
+      </w:r>
+      <w:proofErr w:type="gramStart"/>
+      <w:r>
+        <w:rPr>
+          <w:color w:val="000000" w:themeColor="text1"/>
+          <w:sz w:val="22"/>
+          <w:szCs w:val="22"/>
+        </w:rPr>
+        <w:t>PATH :</w:t>
+      </w:r>
+      <w:proofErr w:type="gramEnd"/>
+      <w:r>
+        <w:rPr>
+          <w:color w:val="000000" w:themeColor="text1"/>
+          <w:sz w:val="22"/>
+          <w:szCs w:val="22"/>
+        </w:rPr>
+        <w:t xml:space="preserve"> NEW_DIRECTORY”</w:t>
+      </w:r>
+    </w:p>
+    <w:p>
+      <w:pPr>
+        <w:rPr>
+          <w:color w:val="000000" w:themeColor="text1"/>
+          <w:sz w:val="22"/>
+          <w:szCs w:val="22"/>
+        </w:rPr>
+      </w:pPr>
+    </w:p>
+    <w:p>
+      <w:pPr>
+        <w:rPr>
+          <w:b/>
+          <w:bCs/>
+          <w:color w:val="000000" w:themeColor="text1"/>
+          <w:u w:val="single"/>
+        </w:rPr>
+      </w:pPr>
+      <w:r>
+        <w:rPr>
+          <w:b/>
+          <w:bCs/>
+          <w:color w:val="000000" w:themeColor="text1"/>
+          <w:u w:val="single"/>
+        </w:rPr>
+        <w:t>Input/Output:</w:t>
+      </w:r>
+    </w:p>
+    <w:p>
+      <w:pPr>
+        <w:pStyle w:val="ListParagraph"/>
+        <w:numPr>
+          <w:ilvl w:val="0"/>
+          <w:numId w:val="3"/>
+        </w:numPr>
+        <w:rPr>
+          <w:color w:val="000000" w:themeColor="text1"/>
+          <w:sz w:val="22"/>
+          <w:szCs w:val="22"/>
+        </w:rPr>
+      </w:pPr>
+      <w:r>
+        <w:rPr>
+          <w:color w:val="000000" w:themeColor="text1"/>
+          <w:sz w:val="22"/>
+          <w:szCs w:val="22"/>
+        </w:rPr>
+        <w:t>The man command means "manual". It displays the documentation (manual page) for a Linux command.</w:t>
+      </w:r>
+    </w:p>
+    <w:p>
+      <w:pPr>
+        <w:pStyle w:val="NormalWeb"/>
+        <w:numPr>
+          <w:ilvl w:val="0"/>
+          <w:numId w:val="3"/>
+        </w:numPr>
+        <w:rPr>
+          <w:rFonts w:asciiTheme="minorHAnsi" w:eastAsiaTheme="minorHAnsi" w:hAnsiTheme="minorHAnsi" w:cstheme="minorBidi"/>
+          <w:color w:val="000000" w:themeColor="text1"/>
+          <w:kern w:val="2"/>
+          <w:sz w:val="22"/>
+          <w:szCs w:val="22"/>
+          <w14:ligatures w14:val="standardContextual"/>
+        </w:rPr>
+      </w:pPr>
+      <w:r>
+        <w:rPr>
+          <w:rFonts w:asciiTheme="minorHAnsi" w:eastAsiaTheme="minorHAnsi" w:hAnsiTheme="minorHAnsi" w:cstheme="minorBidi"/>
+          <w:color w:val="000000" w:themeColor="text1"/>
+          <w:kern w:val="2"/>
+          <w:sz w:val="22"/>
+          <w:szCs w:val="22"/>
+          <w14:ligatures w14:val="standardContextual"/>
+        </w:rPr>
+        <w:t xml:space="preserve">curl is a command-line tool for </w:t>
+      </w:r>
+      <w:r>
+        <w:rPr>
+          <w:rFonts w:asciiTheme="minorHAnsi" w:eastAsiaTheme="minorHAnsi" w:hAnsiTheme="minorHAnsi" w:cstheme="minorBidi"/>
+          <w:b/>
+          <w:bCs/>
+          <w:color w:val="000000" w:themeColor="text1"/>
+          <w:kern w:val="2"/>
+          <w:sz w:val="22"/>
+          <w:szCs w:val="22"/>
+          <w14:ligatures w14:val="standardContextual"/>
+        </w:rPr>
+        <w:t>transferring data to and from servers</w:t>
+      </w:r>
+      <w:r>
+        <w:rPr>
+          <w:rFonts w:asciiTheme="minorHAnsi" w:eastAsiaTheme="minorHAnsi" w:hAnsiTheme="minorHAnsi" w:cstheme="minorBidi"/>
+          <w:color w:val="000000" w:themeColor="text1"/>
+          <w:kern w:val="2"/>
+          <w:sz w:val="22"/>
+          <w:szCs w:val="22"/>
+          <w14:ligatures w14:val="standardContextual"/>
+        </w:rPr>
+        <w:t>. It's commonly used to make HTTP/HTTPS requests, download files, test APIs, and inspect websites.</w:t>
+      </w:r>
+    </w:p>
+    <w:p>
+      <w:pPr>
+        <w:pStyle w:val="ListParagraph"/>
+        <w:numPr>
+          <w:ilvl w:val="0"/>
+          <w:numId w:val="3"/>
+        </w:numPr>
+        <w:rPr>
+          <w:color w:val="000000" w:themeColor="text1"/>
+          <w:sz w:val="22"/>
+          <w:szCs w:val="22"/>
+        </w:rPr>
+      </w:pPr>
+      <w:r>
+        <w:rPr>
+          <w:color w:val="000000" w:themeColor="text1"/>
+          <w:sz w:val="22"/>
+          <w:szCs w:val="22"/>
+        </w:rPr>
+        <w:t xml:space="preserve">Think of it as: </w:t>
+      </w:r>
+      <w:r>
+        <w:rPr>
+          <w:b/>
+          <w:bCs/>
+          <w:color w:val="000000" w:themeColor="text1"/>
+          <w:sz w:val="22"/>
+          <w:szCs w:val="22"/>
+        </w:rPr>
+        <w:t>"Talk to this URL from my terminal."</w:t>
+      </w:r>
+    </w:p>
+    <w:p>
+      <w:pPr>
+        <w:pStyle w:val="HTMLPreformatted"/>
+        <w:numPr>
+          <w:ilvl w:val="0"/>
+          <w:numId w:val="3"/>
+        </w:numPr>
+        <w:rPr>
+          <w:rFonts w:asciiTheme="minorHAnsi" w:eastAsiaTheme="minorHAnsi" w:hAnsiTheme="minorHAnsi" w:cstheme="minorBidi"/>
+          <w:color w:val="000000" w:themeColor="text1"/>
+          <w:kern w:val="2"/>
+          <w:sz w:val="22"/>
+          <w:szCs w:val="22"/>
+          <w14:ligatures w14:val="standardContextual"/>
+        </w:rPr>
+      </w:pPr>
+      <w:r>
+        <w:rPr>
+          <w:rFonts w:asciiTheme="minorHAnsi" w:eastAsiaTheme="minorHAnsi" w:hAnsiTheme="minorHAnsi" w:cstheme="minorBidi"/>
+          <w:color w:val="000000" w:themeColor="text1"/>
+          <w:kern w:val="2"/>
+          <w:sz w:val="22"/>
+          <w:szCs w:val="22"/>
+          <w14:ligatures w14:val="standardContextual"/>
+        </w:rPr>
+        <w:t xml:space="preserve">curl </w:t>
+      </w:r>
+      <w:hyperlink r:id="rId5" w:history="1">
+        <w:r>
+          <w:rPr>
+            <w:rStyle w:val="Hyperlink"/>
+            <w:rFonts w:asciiTheme="minorHAnsi" w:eastAsiaTheme="minorHAnsi" w:hAnsiTheme="minorHAnsi" w:cstheme="minorBidi"/>
+            <w:kern w:val="2"/>
+            <w:sz w:val="22"/>
+            <w:szCs w:val="22"/>
+            <w14:ligatures w14:val="standardContextual"/>
+          </w:rPr>
+          <w:t>https://example.com</w:t>
+        </w:r>
+      </w:hyperlink>
+      <w:r>
+        <w:rPr>
+          <w:rFonts w:asciiTheme="minorHAnsi" w:eastAsiaTheme="minorHAnsi" w:hAnsiTheme="minorHAnsi" w:cstheme="minorBidi"/>
+          <w:color w:val="000000" w:themeColor="text1"/>
+          <w:kern w:val="2"/>
+          <w:sz w:val="22"/>
+          <w:szCs w:val="22"/>
+          <w14:ligatures w14:val="standardContextual"/>
+        </w:rPr>
+        <w:t xml:space="preserve">: </w:t>
+      </w:r>
+      <w:r>
+        <w:rPr>
+          <w:rFonts w:asciiTheme="minorHAnsi" w:eastAsiaTheme="minorHAnsi" w:hAnsiTheme="minorHAnsi" w:cstheme="minorBidi"/>
+          <w:color w:val="000000" w:themeColor="text1"/>
+          <w:kern w:val="2"/>
+          <w:sz w:val="22"/>
+          <w:szCs w:val="22"/>
+          <w14:ligatures w14:val="standardContextual"/>
+        </w:rPr>
+        <w:t>This makes an HTTP request to example.com and prints the response in your terminal.</w:t>
+      </w:r>
+    </w:p>
+    <w:p>
+      <w:pPr>
+        <w:pStyle w:val="HTMLPreformatted"/>
+        <w:numPr>
+          <w:ilvl w:val="0"/>
+          <w:numId w:val="3"/>
+        </w:numPr>
+        <w:rPr>
+          <w:rFonts w:asciiTheme="minorHAnsi" w:eastAsiaTheme="minorHAnsi" w:hAnsiTheme="minorHAnsi" w:cstheme="minorBidi"/>
+          <w:color w:val="000000" w:themeColor="text1"/>
+          <w:kern w:val="2"/>
+          <w:sz w:val="22"/>
+          <w:szCs w:val="22"/>
+          <w14:ligatures w14:val="standardContextual"/>
+        </w:rPr>
+      </w:pPr>
+      <w:r>
+        <w:rPr>
+          <w:rFonts w:asciiTheme="minorHAnsi" w:eastAsiaTheme="minorHAnsi" w:hAnsiTheme="minorHAnsi" w:cstheme="minorBidi"/>
+          <w:color w:val="000000" w:themeColor="text1"/>
+          <w:kern w:val="2"/>
+          <w:sz w:val="22"/>
+          <w:szCs w:val="22"/>
+          <w14:ligatures w14:val="standardContextual"/>
+        </w:rPr>
+        <w:t xml:space="preserve">curl -O </w:t>
+      </w:r>
+      <w:hyperlink r:id="rId6" w:history="1">
+        <w:r>
+          <w:rPr>
+            <w:rStyle w:val="Hyperlink"/>
+            <w:rFonts w:asciiTheme="minorHAnsi" w:eastAsiaTheme="minorHAnsi" w:hAnsiTheme="minorHAnsi" w:cstheme="minorBidi"/>
+            <w:kern w:val="2"/>
+            <w:sz w:val="22"/>
+            <w:szCs w:val="22"/>
+            <w14:ligatures w14:val="standardContextual"/>
+          </w:rPr>
+          <w:t>https://example.com/file.zip</w:t>
+        </w:r>
+      </w:hyperlink>
+      <w:r>
+        <w:rPr>
+          <w:rFonts w:asciiTheme="minorHAnsi" w:eastAsiaTheme="minorHAnsi" w:hAnsiTheme="minorHAnsi" w:cstheme="minorBidi"/>
+          <w:color w:val="000000" w:themeColor="text1"/>
+          <w:kern w:val="2"/>
+          <w:sz w:val="22"/>
+          <w:szCs w:val="22"/>
+          <w14:ligatures w14:val="standardContextual"/>
+        </w:rPr>
+        <w:t xml:space="preserve">: </w:t>
+      </w:r>
+      <w:r>
+        <w:rPr>
+          <w:rFonts w:asciiTheme="minorHAnsi" w:eastAsiaTheme="minorHAnsi" w:hAnsiTheme="minorHAnsi" w:cstheme="minorBidi"/>
+          <w:color w:val="000000" w:themeColor="text1"/>
+          <w:kern w:val="2"/>
+          <w:sz w:val="22"/>
+          <w:szCs w:val="22"/>
+          <w14:ligatures w14:val="standardContextual"/>
+        </w:rPr>
+        <w:t>-O</w:t>
+      </w:r>
+      <w:r>
+        <w:rPr>
+          <w:rFonts w:asciiTheme="minorHAnsi" w:eastAsiaTheme="minorHAnsi" w:hAnsiTheme="minorHAnsi" w:cstheme="minorBidi"/>
+          <w:color w:val="000000" w:themeColor="text1"/>
+          <w:kern w:val="2"/>
+          <w:sz w:val="22"/>
+          <w:szCs w:val="22"/>
+          <w14:ligatures w14:val="standardContextual"/>
+        </w:rPr>
+        <w:t xml:space="preserve"> tells </w:t>
+      </w:r>
+      <w:r>
+        <w:rPr>
+          <w:rFonts w:asciiTheme="minorHAnsi" w:eastAsiaTheme="minorHAnsi" w:hAnsiTheme="minorHAnsi" w:cstheme="minorBidi"/>
+          <w:color w:val="000000" w:themeColor="text1"/>
+          <w:kern w:val="2"/>
+          <w:sz w:val="22"/>
+          <w:szCs w:val="22"/>
+          <w14:ligatures w14:val="standardContextual"/>
+        </w:rPr>
+        <w:t>curl</w:t>
+      </w:r>
+      <w:r>
+        <w:rPr>
+          <w:rFonts w:asciiTheme="minorHAnsi" w:eastAsiaTheme="minorHAnsi" w:hAnsiTheme="minorHAnsi" w:cstheme="minorBidi"/>
+          <w:color w:val="000000" w:themeColor="text1"/>
+          <w:kern w:val="2"/>
+          <w:sz w:val="22"/>
+          <w:szCs w:val="22"/>
+          <w14:ligatures w14:val="standardContextual"/>
+        </w:rPr>
+        <w:t xml:space="preserve"> to save the file using the filename from the URL.</w:t>
+      </w:r>
+      <w:r>
+        <w:rPr>
+          <w:rFonts w:asciiTheme="minorHAnsi" w:eastAsiaTheme="minorHAnsi" w:hAnsiTheme="minorHAnsi" w:cstheme="minorBidi"/>
+          <w:color w:val="000000" w:themeColor="text1"/>
+          <w:kern w:val="2"/>
+          <w:sz w:val="22"/>
+          <w:szCs w:val="22"/>
+          <w14:ligatures w14:val="standardContextual"/>
+        </w:rPr>
+        <w:t xml:space="preserve"> The entire command downloads the file</w:t>
+      </w:r>
+    </w:p>
+    <w:p>
+      <w:pPr>
+        <w:pStyle w:val="pdq2pgselectionanchorcontainer"/>
+        <w:numPr>
+          <w:ilvl w:val="0"/>
+          <w:numId w:val="3"/>
+        </w:numPr>
+        <w:rPr>
+          <w:rFonts w:asciiTheme="minorHAnsi" w:eastAsiaTheme="minorHAnsi" w:hAnsiTheme="minorHAnsi" w:cstheme="minorBidi"/>
+          <w:color w:val="000000" w:themeColor="text1"/>
+          <w:kern w:val="2"/>
+          <w:sz w:val="22"/>
+          <w:szCs w:val="22"/>
+          <w14:ligatures w14:val="standardContextual"/>
+        </w:rPr>
+      </w:pPr>
+      <w:r>
+        <w:rPr>
+          <w:rFonts w:asciiTheme="minorHAnsi" w:eastAsiaTheme="minorHAnsi" w:hAnsiTheme="minorHAnsi" w:cstheme="minorBidi"/>
+          <w:color w:val="000000" w:themeColor="text1"/>
+          <w:kern w:val="2"/>
+          <w:sz w:val="22"/>
+          <w:szCs w:val="22"/>
+          <w14:ligatures w14:val="standardContextual"/>
+        </w:rPr>
+        <w:t>You can choose your own filename with -o:</w:t>
+      </w:r>
+      <w:r>
+        <w:rPr>
+          <w:rFonts w:asciiTheme="minorHAnsi" w:eastAsiaTheme="minorHAnsi" w:hAnsiTheme="minorHAnsi" w:cstheme="minorBidi"/>
+          <w:color w:val="000000" w:themeColor="text1"/>
+          <w:kern w:val="2"/>
+          <w:sz w:val="22"/>
+          <w:szCs w:val="22"/>
+          <w14:ligatures w14:val="standardContextual"/>
+        </w:rPr>
+        <w:t xml:space="preserve"> </w:t>
+      </w:r>
+      <w:r>
+        <w:rPr>
+          <w:rFonts w:asciiTheme="minorHAnsi" w:eastAsiaTheme="minorHAnsi" w:hAnsiTheme="minorHAnsi" w:cstheme="minorBidi"/>
+          <w:color w:val="000000" w:themeColor="text1"/>
+          <w:kern w:val="2"/>
+          <w:sz w:val="22"/>
+          <w:szCs w:val="22"/>
+          <w14:ligatures w14:val="standardContextual"/>
+        </w:rPr>
+        <w:t>curl -o myfile.zip https://example.com/file.zip</w:t>
+      </w:r>
+    </w:p>
+    <w:p>
+      <w:pPr>
+        <w:pStyle w:val="ListParagraph"/>
+        <w:numPr>
+          <w:ilvl w:val="0"/>
+          <w:numId w:val="3"/>
+        </w:numPr>
+        <w:rPr>
+          <w:color w:val="000000" w:themeColor="text1"/>
+          <w:sz w:val="22"/>
+          <w:szCs w:val="22"/>
+        </w:rPr>
+      </w:pPr>
+      <w:r>
+        <w:rPr>
+          <w:color w:val="000000" w:themeColor="text1"/>
+          <w:sz w:val="22"/>
+          <w:szCs w:val="22"/>
+        </w:rPr>
+        <w:t xml:space="preserve">curl -I </w:t>
+      </w:r>
+      <w:hyperlink r:id="rId7" w:history="1">
+        <w:r>
+          <w:rPr>
+            <w:rStyle w:val="Hyperlink"/>
+            <w:sz w:val="22"/>
+            <w:szCs w:val="22"/>
+          </w:rPr>
+          <w:t>https://example.com</w:t>
+        </w:r>
+      </w:hyperlink>
+      <w:r>
+        <w:rPr>
+          <w:color w:val="000000" w:themeColor="text1"/>
+          <w:sz w:val="22"/>
+          <w:szCs w:val="22"/>
+        </w:rPr>
+        <w:t xml:space="preserve"> requests the header inside the endpoints</w:t>
+      </w:r>
+    </w:p>
+    <w:p>
+      <w:pPr>
+        <w:pStyle w:val="pdq2pgselectionanchorcontainer"/>
+        <w:numPr>
+          <w:ilvl w:val="0"/>
+          <w:numId w:val="3"/>
+        </w:numPr>
+        <w:rPr>
+          <w:rFonts w:asciiTheme="minorHAnsi" w:eastAsiaTheme="minorHAnsi" w:hAnsiTheme="minorHAnsi" w:cstheme="minorBidi"/>
+          <w:color w:val="000000" w:themeColor="text1"/>
+          <w:kern w:val="2"/>
+          <w:sz w:val="22"/>
+          <w:szCs w:val="22"/>
+          <w14:ligatures w14:val="standardContextual"/>
+        </w:rPr>
+      </w:pPr>
+      <w:r>
+        <w:rPr>
+          <w:rFonts w:asciiTheme="minorHAnsi" w:eastAsiaTheme="minorHAnsi" w:hAnsiTheme="minorHAnsi" w:cstheme="minorBidi"/>
+          <w:color w:val="000000" w:themeColor="text1"/>
+          <w:kern w:val="2"/>
+          <w:sz w:val="22"/>
+          <w:szCs w:val="22"/>
+          <w14:ligatures w14:val="standardContextual"/>
+        </w:rPr>
+        <w:t>Some URLs redirect you somewhere else. Use:</w:t>
+      </w:r>
+      <w:r>
+        <w:rPr>
+          <w:rFonts w:asciiTheme="minorHAnsi" w:eastAsiaTheme="minorHAnsi" w:hAnsiTheme="minorHAnsi" w:cstheme="minorBidi"/>
+          <w:color w:val="000000" w:themeColor="text1"/>
+          <w:kern w:val="2"/>
+          <w:sz w:val="22"/>
+          <w:szCs w:val="22"/>
+          <w14:ligatures w14:val="standardContextual"/>
+        </w:rPr>
+        <w:t xml:space="preserve"> </w:t>
+      </w:r>
+      <w:r>
+        <w:rPr>
+          <w:rFonts w:asciiTheme="minorHAnsi" w:eastAsiaTheme="minorHAnsi" w:hAnsiTheme="minorHAnsi" w:cstheme="minorBidi"/>
+          <w:color w:val="000000" w:themeColor="text1"/>
+          <w:kern w:val="2"/>
+          <w:sz w:val="22"/>
+          <w:szCs w:val="22"/>
+          <w14:ligatures w14:val="standardContextual"/>
+        </w:rPr>
+        <w:t xml:space="preserve">curl -L </w:t>
+      </w:r>
+      <w:hyperlink r:id="rId8" w:history="1">
+        <w:r>
+          <w:rPr>
+            <w:rStyle w:val="Hyperlink"/>
+            <w:rFonts w:asciiTheme="minorHAnsi" w:eastAsiaTheme="minorHAnsi" w:hAnsiTheme="minorHAnsi" w:cstheme="minorBidi"/>
+            <w:kern w:val="2"/>
+            <w:sz w:val="22"/>
+            <w:szCs w:val="22"/>
+            <w14:ligatures w14:val="standardContextual"/>
+          </w:rPr>
+          <w:t>https://example.com</w:t>
+        </w:r>
+      </w:hyperlink>
+      <w:r>
+        <w:rPr>
+          <w:rFonts w:asciiTheme="minorHAnsi" w:eastAsiaTheme="minorHAnsi" w:hAnsiTheme="minorHAnsi" w:cstheme="minorBidi"/>
+          <w:color w:val="000000" w:themeColor="text1"/>
+          <w:kern w:val="2"/>
+          <w:sz w:val="22"/>
+          <w:szCs w:val="22"/>
+          <w14:ligatures w14:val="standardContextual"/>
+        </w:rPr>
+        <w:t xml:space="preserve"> </w:t>
+      </w:r>
+      <w:r>
+        <w:rPr>
+          <w:rFonts w:asciiTheme="minorHAnsi" w:eastAsiaTheme="minorHAnsi" w:hAnsiTheme="minorHAnsi" w:cstheme="minorBidi"/>
+          <w:color w:val="000000" w:themeColor="text1"/>
+          <w:kern w:val="2"/>
+          <w:sz w:val="22"/>
+          <w:szCs w:val="22"/>
+          <w14:ligatures w14:val="standardContextual"/>
+        </w:rPr>
+        <w:t xml:space="preserve">-L tells curl to </w:t>
+      </w:r>
+      <w:proofErr w:type="gramStart"/>
+      <w:r>
+        <w:rPr>
+          <w:rFonts w:asciiTheme="minorHAnsi" w:eastAsiaTheme="minorHAnsi" w:hAnsiTheme="minorHAnsi" w:cstheme="minorBidi"/>
+          <w:color w:val="000000" w:themeColor="text1"/>
+          <w:kern w:val="2"/>
+          <w:sz w:val="22"/>
+          <w:szCs w:val="22"/>
+          <w14:ligatures w14:val="standardContextual"/>
+        </w:rPr>
+        <w:t>follow redirects.</w:t>
+      </w:r>
+      <w:proofErr w:type="gramEnd"/>
+    </w:p>
+    <w:p>
+      <w:pPr>
+        <w:pStyle w:val="pdq2pgselectionanchorcontainer"/>
+        <w:numPr>
+          <w:ilvl w:val="0"/>
+          <w:numId w:val="3"/>
+        </w:numPr>
+        <w:rPr>
+          <w:rFonts w:asciiTheme="minorHAnsi" w:eastAsiaTheme="minorHAnsi" w:hAnsiTheme="minorHAnsi" w:cstheme="minorBidi"/>
+          <w:color w:val="000000" w:themeColor="text1"/>
+          <w:kern w:val="2"/>
+          <w:sz w:val="22"/>
+          <w:szCs w:val="22"/>
+          <w14:ligatures w14:val="standardContextual"/>
+        </w:rPr>
+      </w:pPr>
+      <w:r>
+        <w:rPr>
+          <w:rFonts w:asciiTheme="minorHAnsi" w:eastAsiaTheme="minorHAnsi" w:hAnsiTheme="minorHAnsi" w:cstheme="minorBidi"/>
+          <w:color w:val="000000" w:themeColor="text1"/>
+          <w:kern w:val="2"/>
+          <w:sz w:val="22"/>
+          <w:szCs w:val="22"/>
+          <w14:ligatures w14:val="standardContextual"/>
+        </w:rPr>
+        <w:t xml:space="preserve">Exactly. -X lets you explicitly specify the </w:t>
+      </w:r>
+      <w:r>
+        <w:rPr>
+          <w:rFonts w:asciiTheme="minorHAnsi" w:eastAsiaTheme="minorHAnsi" w:hAnsiTheme="minorHAnsi" w:cstheme="minorBidi"/>
+          <w:b/>
+          <w:bCs/>
+          <w:color w:val="000000" w:themeColor="text1"/>
+          <w:kern w:val="2"/>
+          <w:sz w:val="22"/>
+          <w:szCs w:val="22"/>
+          <w14:ligatures w14:val="standardContextual"/>
+        </w:rPr>
+        <w:t>HTTP method</w:t>
+      </w:r>
+      <w:r>
+        <w:rPr>
+          <w:rFonts w:asciiTheme="minorHAnsi" w:eastAsiaTheme="minorHAnsi" w:hAnsiTheme="minorHAnsi" w:cstheme="minorBidi"/>
+          <w:color w:val="000000" w:themeColor="text1"/>
+          <w:kern w:val="2"/>
+          <w:sz w:val="22"/>
+          <w:szCs w:val="22"/>
+          <w14:ligatures w14:val="standardContextual"/>
+        </w:rPr>
+        <w:t xml:space="preserve"> that curl should use.</w:t>
+      </w:r>
+      <w:r>
+        <w:rPr>
+          <w:rFonts w:asciiTheme="minorHAnsi" w:eastAsiaTheme="minorHAnsi" w:hAnsiTheme="minorHAnsi" w:cstheme="minorBidi"/>
+          <w:color w:val="000000" w:themeColor="text1"/>
+          <w:kern w:val="2"/>
+          <w:sz w:val="22"/>
+          <w:szCs w:val="22"/>
+          <w14:ligatures w14:val="standardContextual"/>
+        </w:rPr>
+        <w:t xml:space="preserve"> </w:t>
+      </w:r>
+      <w:r>
+        <w:rPr>
+          <w:rFonts w:asciiTheme="minorHAnsi" w:eastAsiaTheme="minorHAnsi" w:hAnsiTheme="minorHAnsi" w:cstheme="minorBidi"/>
+          <w:color w:val="000000" w:themeColor="text1"/>
+          <w:kern w:val="2"/>
+          <w:sz w:val="22"/>
+          <w:szCs w:val="22"/>
+          <w14:ligatures w14:val="standardContextual"/>
+        </w:rPr>
+        <w:t>For example:</w:t>
+      </w:r>
+      <w:r>
+        <w:rPr>
+          <w:rFonts w:asciiTheme="minorHAnsi" w:eastAsiaTheme="minorHAnsi" w:hAnsiTheme="minorHAnsi" w:cstheme="minorBidi"/>
+          <w:color w:val="000000" w:themeColor="text1"/>
+          <w:kern w:val="2"/>
+          <w:sz w:val="22"/>
+          <w:szCs w:val="22"/>
+          <w14:ligatures w14:val="standardContextual"/>
+        </w:rPr>
+        <w:t xml:space="preserve"> c</w:t>
+      </w:r>
+      <w:r>
+        <w:rPr>
+          <w:rFonts w:asciiTheme="minorHAnsi" w:eastAsiaTheme="minorHAnsi" w:hAnsiTheme="minorHAnsi" w:cstheme="minorBidi"/>
+          <w:color w:val="000000" w:themeColor="text1"/>
+          <w:kern w:val="2"/>
+          <w:sz w:val="22"/>
+          <w:szCs w:val="22"/>
+          <w14:ligatures w14:val="standardContextual"/>
+        </w:rPr>
+        <w:t>url -X GET https://api.example.com/user</w:t>
+      </w:r>
+    </w:p>
+    <w:p>
+      <w:pPr>
+        <w:pStyle w:val="ListParagraph"/>
+        <w:numPr>
+          <w:ilvl w:val="0"/>
+          <w:numId w:val="3"/>
+        </w:numPr>
+        <w:rPr>
+          <w:color w:val="000000" w:themeColor="text1"/>
+          <w:sz w:val="22"/>
+          <w:szCs w:val="22"/>
+        </w:rPr>
+      </w:pPr>
+    </w:p>
+    <w:p>
+      <w:pPr>
+        <w:rPr>
+          <w:b/>
+          <w:bCs/>
+          <w:color w:val="000000" w:themeColor="text1"/>
+          <w:sz w:val="22"/>
+          <w:szCs w:val="22"/>
+        </w:rPr>
+      </w:pPr>
     </w:p>
     <w:sectPr>
       <w:pgSz w:w="12240" w:h="15840"/>
@@ -2511,7 +3816,7 @@
   <w:abstractNum w:abstractNumId="0" w15:restartNumberingAfterBreak="0">
     <w:nsid w:val="1D230BAD"/>
     <w:multiLevelType w:val="hybridMultilevel"/>
-    <w:tmpl w:val="4A621668"/>
+    <w:tmpl w:val="CD0839F4"/>
     <w:lvl w:ilvl="0" w:tplc="04090001">
       <w:start w:val="1"/>
       <w:numFmt w:val="bullet"/>
@@ -2622,9 +3927,9 @@
     </w:lvl>
   </w:abstractNum>
   <w:abstractNum w:abstractNumId="1" w15:restartNumberingAfterBreak="0">
-    <w:nsid w:val="7EE55C6C"/>
+    <w:nsid w:val="257B119F"/>
     <w:multiLevelType w:val="hybridMultilevel"/>
-    <w:tmpl w:val="C5D4FA0C"/>
+    <w:tmpl w:val="5FB62D98"/>
     <w:lvl w:ilvl="0" w:tplc="04090001">
       <w:start w:val="1"/>
       <w:numFmt w:val="bullet"/>
@@ -2734,11 +4039,127 @@
       </w:rPr>
     </w:lvl>
   </w:abstractNum>
+  <w:abstractNum w:abstractNumId="2" w15:restartNumberingAfterBreak="0">
+    <w:nsid w:val="7EE55C6C"/>
+    <w:multiLevelType w:val="hybridMultilevel"/>
+    <w:tmpl w:val="C5D4FA0C"/>
+    <w:lvl w:ilvl="0" w:tplc="04090001">
+      <w:start w:val="1"/>
+      <w:numFmt w:val="bullet"/>
+      <w:lvlText w:val=""/>
+      <w:lvlJc w:val="left"/>
+      <w:pPr>
+        <w:ind w:left="720" w:hanging="360"/>
+      </w:pPr>
+      <w:rPr>
+        <w:rFonts w:ascii="Symbol" w:hAnsi="Symbol" w:hint="default"/>
+      </w:rPr>
+    </w:lvl>
+    <w:lvl w:ilvl="1" w:tplc="04090003" w:tentative="1">
+      <w:start w:val="1"/>
+      <w:numFmt w:val="bullet"/>
+      <w:lvlText w:val="o"/>
+      <w:lvlJc w:val="left"/>
+      <w:pPr>
+        <w:ind w:left="1440" w:hanging="360"/>
+      </w:pPr>
+      <w:rPr>
+        <w:rFonts w:ascii="Courier New" w:hAnsi="Courier New" w:cs="Courier New" w:hint="default"/>
+      </w:rPr>
+    </w:lvl>
+    <w:lvl w:ilvl="2" w:tplc="04090005" w:tentative="1">
+      <w:start w:val="1"/>
+      <w:numFmt w:val="bullet"/>
+      <w:lvlText w:val=""/>
+      <w:lvlJc w:val="left"/>
+      <w:pPr>
+        <w:ind w:left="2160" w:hanging="360"/>
+      </w:pPr>
+      <w:rPr>
+        <w:rFonts w:ascii="Wingdings" w:hAnsi="Wingdings" w:hint="default"/>
+      </w:rPr>
+    </w:lvl>
+    <w:lvl w:ilvl="3" w:tplc="04090001" w:tentative="1">
+      <w:start w:val="1"/>
+      <w:numFmt w:val="bullet"/>
+      <w:lvlText w:val=""/>
+      <w:lvlJc w:val="left"/>
+      <w:pPr>
+        <w:ind w:left="2880" w:hanging="360"/>
+      </w:pPr>
+      <w:rPr>
+        <w:rFonts w:ascii="Symbol" w:hAnsi="Symbol" w:hint="default"/>
+      </w:rPr>
+    </w:lvl>
+    <w:lvl w:ilvl="4" w:tplc="04090003" w:tentative="1">
+      <w:start w:val="1"/>
+      <w:numFmt w:val="bullet"/>
+      <w:lvlText w:val="o"/>
+      <w:lvlJc w:val="left"/>
+      <w:pPr>
+        <w:ind w:left="3600" w:hanging="360"/>
+      </w:pPr>
+      <w:rPr>
+        <w:rFonts w:ascii="Courier New" w:hAnsi="Courier New" w:cs="Courier New" w:hint="default"/>
+      </w:rPr>
+    </w:lvl>
+    <w:lvl w:ilvl="5" w:tplc="04090005" w:tentative="1">
+      <w:start w:val="1"/>
+      <w:numFmt w:val="bullet"/>
+      <w:lvlText w:val=""/>
+      <w:lvlJc w:val="left"/>
+      <w:pPr>
+        <w:ind w:left="4320" w:hanging="360"/>
+      </w:pPr>
+      <w:rPr>
+        <w:rFonts w:ascii="Wingdings" w:hAnsi="Wingdings" w:hint="default"/>
+      </w:rPr>
+    </w:lvl>
+    <w:lvl w:ilvl="6" w:tplc="04090001" w:tentative="1">
+      <w:start w:val="1"/>
+      <w:numFmt w:val="bullet"/>
+      <w:lvlText w:val=""/>
+      <w:lvlJc w:val="left"/>
+      <w:pPr>
+        <w:ind w:left="5040" w:hanging="360"/>
+      </w:pPr>
+      <w:rPr>
+        <w:rFonts w:ascii="Symbol" w:hAnsi="Symbol" w:hint="default"/>
+      </w:rPr>
+    </w:lvl>
+    <w:lvl w:ilvl="7" w:tplc="04090003" w:tentative="1">
+      <w:start w:val="1"/>
+      <w:numFmt w:val="bullet"/>
+      <w:lvlText w:val="o"/>
+      <w:lvlJc w:val="left"/>
+      <w:pPr>
+        <w:ind w:left="5760" w:hanging="360"/>
+      </w:pPr>
+      <w:rPr>
+        <w:rFonts w:ascii="Courier New" w:hAnsi="Courier New" w:cs="Courier New" w:hint="default"/>
+      </w:rPr>
+    </w:lvl>
+    <w:lvl w:ilvl="8" w:tplc="04090005" w:tentative="1">
+      <w:start w:val="1"/>
+      <w:numFmt w:val="bullet"/>
+      <w:lvlText w:val=""/>
+      <w:lvlJc w:val="left"/>
+      <w:pPr>
+        <w:ind w:left="6480" w:hanging="360"/>
+      </w:pPr>
+      <w:rPr>
+        <w:rFonts w:ascii="Wingdings" w:hAnsi="Wingdings" w:hint="default"/>
+      </w:rPr>
+    </w:lvl>
+  </w:abstractNum>
   <w:num w:numId="1" w16cid:durableId="1818641055">
-    <w:abstractNumId w:val="1"/>
+    <w:abstractNumId w:val="2"/>
   </w:num>
   <w:num w:numId="2" w16cid:durableId="1874223574">
     <w:abstractNumId w:val="0"/>
+  </w:num>
+  <w:num w:numId="3" w16cid:durableId="893740679">
+    <w:abstractNumId w:val="1"/>
   </w:num>
 </w:numbering>
 </file>
@@ -3194,7 +4615,6 @@
     <w:next w:val="Normal"/>
     <w:link w:val="Heading3Char"/>
     <w:uiPriority w:val="9"/>
-    <w:semiHidden/>
     <w:unhideWhenUsed/>
     <w:qFormat/>
     <w:rsid w:val="005A3928"/>
@@ -3401,7 +4821,6 @@
     <w:basedOn w:val="DefaultParagraphFont"/>
     <w:link w:val="Heading3"/>
     <w:uiPriority w:val="9"/>
-    <w:semiHidden/>
     <w:rsid w:val="005A3928"/>
     <w:rPr>
       <w:rFonts w:eastAsiaTheme="majorEastAsia" w:cstheme="majorBidi"/>
@@ -3700,7 +5119,6 @@
     <w:basedOn w:val="Normal"/>
     <w:link w:val="HTMLPreformattedChar"/>
     <w:uiPriority w:val="99"/>
-    <w:semiHidden/>
     <w:unhideWhenUsed/>
     <w:rsid w:val="00C0261D"/>
     <w:pPr>
@@ -3737,7 +5155,6 @@
     <w:basedOn w:val="DefaultParagraphFont"/>
     <w:link w:val="HTMLPreformatted"/>
     <w:uiPriority w:val="99"/>
-    <w:semiHidden/>
     <w:rsid w:val="00C0261D"/>
     <w:rPr>
       <w:rFonts w:ascii="Courier New" w:eastAsia="Times New Roman" w:hAnsi="Courier New" w:cs="Courier New"/>
@@ -3759,6 +5176,43 @@
       <w:sz w:val="20"/>
       <w:szCs w:val="20"/>
     </w:rPr>
+  </w:style>
+  <w:style w:type="character" w:styleId="Strong">
+    <w:name w:val="Strong"/>
+    <w:basedOn w:val="DefaultParagraphFont"/>
+    <w:uiPriority w:val="22"/>
+    <w:qFormat/>
+    <w:rsid w:val="00C66E43"/>
+    <w:rPr>
+      <w:b/>
+      <w:bCs/>
+    </w:rPr>
+  </w:style>
+  <w:style w:type="paragraph" w:styleId="NormalWeb">
+    <w:name w:val="Normal (Web)"/>
+    <w:basedOn w:val="Normal"/>
+    <w:uiPriority w:val="99"/>
+    <w:semiHidden/>
+    <w:unhideWhenUsed/>
+    <w:rsid w:val="00C66E43"/>
+    <w:pPr>
+      <w:spacing w:before="100" w:beforeAutospacing="1" w:after="100" w:afterAutospacing="1" w:line="240" w:lineRule="auto"/>
+    </w:pPr>
+    <w:rPr>
+      <w:rFonts w:ascii="Times New Roman" w:eastAsia="Times New Roman" w:hAnsi="Times New Roman" w:cs="Times New Roman"/>
+      <w:kern w:val="0"/>
+      <w14:ligatures w14:val="none"/>
+    </w:rPr>
+  </w:style>
+  <w:style w:type="character" w:customStyle="1" w:styleId="10">
+    <w:name w:val="ͼ10"/>
+    <w:basedOn w:val="DefaultParagraphFont"/>
+    <w:rsid w:val="00F00BC2"/>
+  </w:style>
+  <w:style w:type="character" w:customStyle="1" w:styleId="12">
+    <w:name w:val="ͼ12"/>
+    <w:basedOn w:val="DefaultParagraphFont"/>
+    <w:rsid w:val="00F00BC2"/>
   </w:style>
 </w:styles>
 </file>

</xml_diff>

<commit_message>
add the base notes for bedrock
</commit_message>
<xml_diff>
--- a/Linux/Notes.docx
+++ b/Linux/Notes.docx
@@ -3775,6 +3775,163 @@
         <w:rPr>
           <w:b/>
           <w:bCs/>
+          <w:color w:val="000000" w:themeColor="text1"/>
+          <w:sz w:val="22"/>
+          <w:szCs w:val="22"/>
+        </w:rPr>
+      </w:pPr>
+    </w:p>
+    <w:p>
+      <w:pPr>
+        <w:rPr>
+          <w:b/>
+          <w:bCs/>
+          <w:color w:val="000000" w:themeColor="text1"/>
+          <w:u w:val="single"/>
+        </w:rPr>
+      </w:pPr>
+      <w:r>
+        <w:rPr>
+          <w:b/>
+          <w:bCs/>
+          <w:color w:val="000000" w:themeColor="text1"/>
+          <w:u w:val="single"/>
+        </w:rPr>
+        <w:lastRenderedPageBreak/>
+        <w:t>Package manager:</w:t>
+      </w:r>
+    </w:p>
+    <w:p>
+      <w:pPr>
+        <w:pStyle w:val="ListParagraph"/>
+        <w:numPr>
+          <w:ilvl w:val="0"/>
+          <w:numId w:val="4"/>
+        </w:numPr>
+        <w:rPr>
+          <w:b/>
+          <w:bCs/>
+          <w:color w:val="000000" w:themeColor="text1"/>
+          <w:sz w:val="22"/>
+          <w:szCs w:val="22"/>
+        </w:rPr>
+      </w:pPr>
+      <w:proofErr w:type="spellStart"/>
+      <w:r>
+        <w:rPr>
+          <w:b/>
+          <w:bCs/>
+          <w:color w:val="000000" w:themeColor="text1"/>
+          <w:sz w:val="22"/>
+          <w:szCs w:val="22"/>
+        </w:rPr>
+        <w:t>sudo</w:t>
+      </w:r>
+      <w:proofErr w:type="spellEnd"/>
+      <w:r>
+        <w:rPr>
+          <w:b/>
+          <w:bCs/>
+          <w:color w:val="000000" w:themeColor="text1"/>
+          <w:sz w:val="22"/>
+          <w:szCs w:val="22"/>
+        </w:rPr>
+        <w:t xml:space="preserve"> apt</w:t>
+      </w:r>
+      <w:r>
+        <w:rPr>
+          <w:b/>
+          <w:bCs/>
+          <w:color w:val="000000" w:themeColor="text1"/>
+          <w:sz w:val="22"/>
+          <w:szCs w:val="22"/>
+        </w:rPr>
+        <w:t xml:space="preserve"> </w:t>
+      </w:r>
+      <w:proofErr w:type="spellStart"/>
+      <w:r>
+        <w:rPr>
+          <w:b/>
+          <w:bCs/>
+          <w:color w:val="000000" w:themeColor="text1"/>
+          <w:sz w:val="22"/>
+          <w:szCs w:val="22"/>
+        </w:rPr>
+        <w:t>sudo</w:t>
+      </w:r>
+      <w:proofErr w:type="spellEnd"/>
+      <w:r>
+        <w:rPr>
+          <w:color w:val="000000" w:themeColor="text1"/>
+          <w:sz w:val="22"/>
+          <w:szCs w:val="22"/>
+        </w:rPr>
+        <w:t xml:space="preserve"> = “run this command with administrator (root) privileges.</w:t>
+      </w:r>
+      <w:r>
+        <w:rPr>
+          <w:color w:val="000000" w:themeColor="text1"/>
+          <w:sz w:val="22"/>
+          <w:szCs w:val="22"/>
+        </w:rPr>
+        <w:t xml:space="preserve"> </w:t>
+      </w:r>
+      <w:r>
+        <w:rPr>
+          <w:b/>
+          <w:bCs/>
+          <w:color w:val="000000" w:themeColor="text1"/>
+          <w:sz w:val="22"/>
+          <w:szCs w:val="22"/>
+        </w:rPr>
+        <w:t>apt</w:t>
+      </w:r>
+      <w:r>
+        <w:rPr>
+          <w:color w:val="000000" w:themeColor="text1"/>
+          <w:sz w:val="22"/>
+          <w:szCs w:val="22"/>
+        </w:rPr>
+        <w:t xml:space="preserve"> = the </w:t>
+      </w:r>
+      <w:r>
+        <w:rPr>
+          <w:b/>
+          <w:bCs/>
+          <w:color w:val="000000" w:themeColor="text1"/>
+          <w:sz w:val="22"/>
+          <w:szCs w:val="22"/>
+        </w:rPr>
+        <w:t>package manager</w:t>
+      </w:r>
+      <w:r>
+        <w:rPr>
+          <w:color w:val="000000" w:themeColor="text1"/>
+          <w:sz w:val="22"/>
+          <w:szCs w:val="22"/>
+        </w:rPr>
+        <w:t xml:space="preserve"> used by Debian/Ubuntu-based Linux systems. It lets you install, update, remove, and search for software.</w:t>
+      </w:r>
+    </w:p>
+    <w:p>
+      <w:pPr>
+        <w:pStyle w:val="ListParagraph"/>
+        <w:numPr>
+          <w:ilvl w:val="0"/>
+          <w:numId w:val="4"/>
+        </w:numPr>
+        <w:rPr>
+          <w:b/>
+          <w:bCs/>
+          <w:color w:val="000000" w:themeColor="text1"/>
+          <w:sz w:val="22"/>
+          <w:szCs w:val="22"/>
+        </w:rPr>
+      </w:pPr>
+    </w:p>
+    <w:p>
+      <w:pPr>
+        <w:rPr>
           <w:color w:val="000000" w:themeColor="text1"/>
           <w:sz w:val="22"/>
           <w:szCs w:val="22"/>
@@ -4020,9 +4177,9 @@
     </w:lvl>
   </w:abstractNum>
   <w:abstractNum w:abstractNumId="2" w15:restartNumberingAfterBreak="0">
-    <w:nsid w:val="7EE55C6C"/>
+    <w:nsid w:val="3269359A"/>
     <w:multiLevelType w:val="hybridMultilevel"/>
-    <w:tmpl w:val="C5D4FA0C"/>
+    <w:tmpl w:val="11506ECE"/>
     <w:lvl w:ilvl="0" w:tplc="04090001">
       <w:start w:val="1"/>
       <w:numFmt w:val="bullet"/>
@@ -4132,14 +4289,130 @@
       </w:rPr>
     </w:lvl>
   </w:abstractNum>
+  <w:abstractNum w:abstractNumId="3" w15:restartNumberingAfterBreak="0">
+    <w:nsid w:val="7EE55C6C"/>
+    <w:multiLevelType w:val="hybridMultilevel"/>
+    <w:tmpl w:val="C5D4FA0C"/>
+    <w:lvl w:ilvl="0" w:tplc="04090001">
+      <w:start w:val="1"/>
+      <w:numFmt w:val="bullet"/>
+      <w:lvlText w:val=""/>
+      <w:lvlJc w:val="left"/>
+      <w:pPr>
+        <w:ind w:left="720" w:hanging="360"/>
+      </w:pPr>
+      <w:rPr>
+        <w:rFonts w:ascii="Symbol" w:hAnsi="Symbol" w:hint="default"/>
+      </w:rPr>
+    </w:lvl>
+    <w:lvl w:ilvl="1" w:tplc="04090003" w:tentative="1">
+      <w:start w:val="1"/>
+      <w:numFmt w:val="bullet"/>
+      <w:lvlText w:val="o"/>
+      <w:lvlJc w:val="left"/>
+      <w:pPr>
+        <w:ind w:left="1440" w:hanging="360"/>
+      </w:pPr>
+      <w:rPr>
+        <w:rFonts w:ascii="Courier New" w:hAnsi="Courier New" w:cs="Courier New" w:hint="default"/>
+      </w:rPr>
+    </w:lvl>
+    <w:lvl w:ilvl="2" w:tplc="04090005" w:tentative="1">
+      <w:start w:val="1"/>
+      <w:numFmt w:val="bullet"/>
+      <w:lvlText w:val=""/>
+      <w:lvlJc w:val="left"/>
+      <w:pPr>
+        <w:ind w:left="2160" w:hanging="360"/>
+      </w:pPr>
+      <w:rPr>
+        <w:rFonts w:ascii="Wingdings" w:hAnsi="Wingdings" w:hint="default"/>
+      </w:rPr>
+    </w:lvl>
+    <w:lvl w:ilvl="3" w:tplc="04090001" w:tentative="1">
+      <w:start w:val="1"/>
+      <w:numFmt w:val="bullet"/>
+      <w:lvlText w:val=""/>
+      <w:lvlJc w:val="left"/>
+      <w:pPr>
+        <w:ind w:left="2880" w:hanging="360"/>
+      </w:pPr>
+      <w:rPr>
+        <w:rFonts w:ascii="Symbol" w:hAnsi="Symbol" w:hint="default"/>
+      </w:rPr>
+    </w:lvl>
+    <w:lvl w:ilvl="4" w:tplc="04090003" w:tentative="1">
+      <w:start w:val="1"/>
+      <w:numFmt w:val="bullet"/>
+      <w:lvlText w:val="o"/>
+      <w:lvlJc w:val="left"/>
+      <w:pPr>
+        <w:ind w:left="3600" w:hanging="360"/>
+      </w:pPr>
+      <w:rPr>
+        <w:rFonts w:ascii="Courier New" w:hAnsi="Courier New" w:cs="Courier New" w:hint="default"/>
+      </w:rPr>
+    </w:lvl>
+    <w:lvl w:ilvl="5" w:tplc="04090005" w:tentative="1">
+      <w:start w:val="1"/>
+      <w:numFmt w:val="bullet"/>
+      <w:lvlText w:val=""/>
+      <w:lvlJc w:val="left"/>
+      <w:pPr>
+        <w:ind w:left="4320" w:hanging="360"/>
+      </w:pPr>
+      <w:rPr>
+        <w:rFonts w:ascii="Wingdings" w:hAnsi="Wingdings" w:hint="default"/>
+      </w:rPr>
+    </w:lvl>
+    <w:lvl w:ilvl="6" w:tplc="04090001" w:tentative="1">
+      <w:start w:val="1"/>
+      <w:numFmt w:val="bullet"/>
+      <w:lvlText w:val=""/>
+      <w:lvlJc w:val="left"/>
+      <w:pPr>
+        <w:ind w:left="5040" w:hanging="360"/>
+      </w:pPr>
+      <w:rPr>
+        <w:rFonts w:ascii="Symbol" w:hAnsi="Symbol" w:hint="default"/>
+      </w:rPr>
+    </w:lvl>
+    <w:lvl w:ilvl="7" w:tplc="04090003" w:tentative="1">
+      <w:start w:val="1"/>
+      <w:numFmt w:val="bullet"/>
+      <w:lvlText w:val="o"/>
+      <w:lvlJc w:val="left"/>
+      <w:pPr>
+        <w:ind w:left="5760" w:hanging="360"/>
+      </w:pPr>
+      <w:rPr>
+        <w:rFonts w:ascii="Courier New" w:hAnsi="Courier New" w:cs="Courier New" w:hint="default"/>
+      </w:rPr>
+    </w:lvl>
+    <w:lvl w:ilvl="8" w:tplc="04090005" w:tentative="1">
+      <w:start w:val="1"/>
+      <w:numFmt w:val="bullet"/>
+      <w:lvlText w:val=""/>
+      <w:lvlJc w:val="left"/>
+      <w:pPr>
+        <w:ind w:left="6480" w:hanging="360"/>
+      </w:pPr>
+      <w:rPr>
+        <w:rFonts w:ascii="Wingdings" w:hAnsi="Wingdings" w:hint="default"/>
+      </w:rPr>
+    </w:lvl>
+  </w:abstractNum>
   <w:num w:numId="1" w16cid:durableId="1818641055">
-    <w:abstractNumId w:val="2"/>
+    <w:abstractNumId w:val="3"/>
   </w:num>
   <w:num w:numId="2" w16cid:durableId="1874223574">
     <w:abstractNumId w:val="0"/>
   </w:num>
   <w:num w:numId="3" w16cid:durableId="893740679">
     <w:abstractNumId w:val="1"/>
+  </w:num>
+  <w:num w:numId="4" w16cid:durableId="28576545">
+    <w:abstractNumId w:val="2"/>
   </w:num>
 </w:numbering>
 </file>
@@ -4746,7 +5019,6 @@
   <w:style w:type="character" w:default="1" w:styleId="DefaultParagraphFont">
     <w:name w:val="Default Paragraph Font"/>
     <w:uiPriority w:val="1"/>
-    <w:semiHidden/>
     <w:unhideWhenUsed/>
   </w:style>
   <w:style w:type="table" w:default="1" w:styleId="TableNormal">

</xml_diff>